<commit_message>
feat: update workshop student guide and readme
</commit_message>
<xml_diff>
--- a/handout/L6_student_guide.docx
+++ b/handout/L6_student_guide.docx
@@ -401,7 +401,28 @@
                 <w:color w:val="222222"/>
                 <w:sz w:val="20"/>
               </w:rPr>
-              <w:t>What makes some words faster to recognise than others? Today you will use a real lexical decision teaching dataset to test whether word length, log frequency, age of acquisition, and orthographic neighbourhood structure predict mean response time. The dataset is derived from the English Lexicon Project, with age-of-acquisition information merged in (Balota et al., 2007; Kuperman et al., 2012).</w:t>
+              <w:t>What makes some words faster to recognise than others? Today you will use a real lexical decision teaching dataset to test whether word length, log frequency, age of acquisition, and orthographic neighbourhood structure predict mean response time. The dataset is derived from the English Lexicon Project, with age-of-acquisition information</w:t>
+            </w:r>
+            <w:r>
+              <w:rPr>
+                <w:rFonts w:hint="default" w:eastAsia="Calibri"/>
+                <w:b w:val="0"/>
+                <w:i w:val="0"/>
+                <w:color w:val="222222"/>
+                <w:sz w:val="20"/>
+                <w:lang w:val="en-GB"/>
+              </w:rPr>
+              <w:t xml:space="preserve"> and OLD20</w:t>
+            </w:r>
+            <w:r>
+              <w:rPr>
+                <w:rFonts w:ascii="Calibri" w:hAnsi="Calibri" w:eastAsia="Calibri"/>
+                <w:b w:val="0"/>
+                <w:i w:val="0"/>
+                <w:color w:val="222222"/>
+                <w:sz w:val="20"/>
+              </w:rPr>
+              <w:t xml:space="preserve"> merged in (Balota et al., 2007; Kuperman et al., 2012).</w:t>
             </w:r>
           </w:p>
         </w:tc>
@@ -409,12 +430,12 @@
     </w:tbl>
     <w:p>
       <w:pPr>
-        <w:pStyle w:val="164"/>
+        <w:pStyle w:val="165"/>
       </w:pPr>
     </w:p>
     <w:p>
       <w:pPr>
-        <w:pStyle w:val="165"/>
+        <w:pStyle w:val="166"/>
       </w:pPr>
       <w:r>
         <w:t>By the end of the workshop, you should be able to</w:t>
@@ -572,7 +593,7 @@
     </w:p>
     <w:p>
       <w:pPr>
-        <w:pStyle w:val="165"/>
+        <w:pStyle w:val="166"/>
       </w:pPr>
       <w:r>
         <w:t>Today's route</w:t>
@@ -580,7 +601,7 @@
     </w:p>
     <w:tbl>
       <w:tblPr>
-        <w:tblStyle w:val="35"/>
+        <w:tblStyle w:val="36"/>
         <w:tblW w:w="0" w:type="auto"/>
         <w:jc w:val="center"/>
         <w:tblBorders>
@@ -796,6 +817,12 @@
             <w:insideH w:val="single" w:color="auto" w:sz="4" w:space="0"/>
             <w:insideV w:val="single" w:color="auto" w:sz="4" w:space="0"/>
           </w:tblBorders>
+          <w:tblCellMar>
+            <w:top w:w="0" w:type="dxa"/>
+            <w:left w:w="108" w:type="dxa"/>
+            <w:bottom w:w="0" w:type="dxa"/>
+            <w:right w:w="108" w:type="dxa"/>
+          </w:tblCellMar>
         </w:tblPrEx>
         <w:trPr>
           <w:jc w:val="center"/>
@@ -881,12 +908,6 @@
             <w:insideH w:val="single" w:color="auto" w:sz="4" w:space="0"/>
             <w:insideV w:val="single" w:color="auto" w:sz="4" w:space="0"/>
           </w:tblBorders>
-          <w:tblCellMar>
-            <w:top w:w="0" w:type="dxa"/>
-            <w:left w:w="108" w:type="dxa"/>
-            <w:bottom w:w="0" w:type="dxa"/>
-            <w:right w:w="108" w:type="dxa"/>
-          </w:tblCellMar>
         </w:tblPrEx>
         <w:trPr>
           <w:jc w:val="center"/>
@@ -1154,6 +1175,12 @@
             <w:insideH w:val="single" w:color="auto" w:sz="4" w:space="0"/>
             <w:insideV w:val="single" w:color="auto" w:sz="4" w:space="0"/>
           </w:tblBorders>
+          <w:tblCellMar>
+            <w:top w:w="0" w:type="dxa"/>
+            <w:left w:w="108" w:type="dxa"/>
+            <w:bottom w:w="0" w:type="dxa"/>
+            <w:right w:w="108" w:type="dxa"/>
+          </w:tblCellMar>
         </w:tblPrEx>
         <w:trPr>
           <w:jc w:val="center"/>
@@ -1243,7 +1270,7 @@
     </w:tbl>
     <w:p>
       <w:pPr>
-        <w:pStyle w:val="164"/>
+        <w:pStyle w:val="165"/>
       </w:pPr>
     </w:p>
     <w:tbl>
@@ -1411,12 +1438,12 @@
     </w:tbl>
     <w:p>
       <w:pPr>
-        <w:pStyle w:val="164"/>
+        <w:pStyle w:val="165"/>
       </w:pPr>
     </w:p>
     <w:p>
       <w:pPr>
-        <w:pStyle w:val="165"/>
+        <w:pStyle w:val="166"/>
       </w:pPr>
       <w:r>
         <w:t>1. Quick recap: what is lexical decision?</w:t>
@@ -1450,6 +1477,10 @@
     <w:p>
       <w:pPr>
         <w:ind w:left="255" w:hanging="198"/>
+        <w:rPr>
+          <w:rFonts w:hint="default"/>
+          <w:lang w:val="en-GB"/>
+        </w:rPr>
       </w:pPr>
       <w:r>
         <w:rPr>
@@ -1469,7 +1500,18 @@
           <w:color w:val="222222"/>
           <w:sz w:val="21"/>
         </w:rPr>
-        <w:t>Today, each row in the file is one English word, not one participant trial.</w:t>
+        <w:t>Today, each row in the file is one English word</w:t>
+      </w:r>
+      <w:r>
+        <w:rPr>
+          <w:rFonts w:hint="default" w:eastAsia="Calibri"/>
+          <w:b w:val="0"/>
+          <w:i w:val="0"/>
+          <w:color w:val="222222"/>
+          <w:sz w:val="21"/>
+          <w:lang w:val="en-GB"/>
+        </w:rPr>
+        <w:t xml:space="preserve"> - with averaged responses across multiple participants.</w:t>
       </w:r>
     </w:p>
     <w:p>
@@ -1529,7 +1571,7 @@
     </w:p>
     <w:p>
       <w:pPr>
-        <w:pStyle w:val="165"/>
+        <w:pStyle w:val="166"/>
       </w:pPr>
       <w:r>
         <w:t>2. Meet the dataset</w:t>
@@ -1537,7 +1579,7 @@
     </w:p>
     <w:tbl>
       <w:tblPr>
-        <w:tblStyle w:val="35"/>
+        <w:tblStyle w:val="36"/>
         <w:tblW w:w="0" w:type="auto"/>
         <w:jc w:val="center"/>
         <w:tblBorders>
@@ -1571,6 +1613,12 @@
             <w:insideH w:val="single" w:color="auto" w:sz="4" w:space="0"/>
             <w:insideV w:val="single" w:color="auto" w:sz="4" w:space="0"/>
           </w:tblBorders>
+          <w:tblCellMar>
+            <w:top w:w="0" w:type="dxa"/>
+            <w:left w:w="108" w:type="dxa"/>
+            <w:bottom w:w="0" w:type="dxa"/>
+            <w:right w:w="108" w:type="dxa"/>
+          </w:tblCellMar>
         </w:tblPrEx>
         <w:trPr>
           <w:tblHeader/>
@@ -1668,16 +1716,21 @@
             <w:pPr>
               <w:spacing w:after="0"/>
               <w:jc w:val="center"/>
+              <w:rPr>
+                <w:rFonts w:hint="default"/>
+                <w:lang w:val="en-GB"/>
+              </w:rPr>
             </w:pPr>
             <w:r>
               <w:rPr>
-                <w:rFonts w:ascii="Calibri" w:hAnsi="Calibri" w:eastAsia="Calibri"/>
+                <w:rFonts w:hint="default" w:eastAsia="Calibri"/>
                 <w:b/>
                 <w:i w:val="0"/>
                 <w:color w:val="FFFFFF"/>
                 <w:sz w:val="19"/>
+                <w:lang w:val="en-GB"/>
               </w:rPr>
-              <w:t>Helpful reminder</w:t>
+              <w:t>Notes</w:t>
             </w:r>
           </w:p>
         </w:tc>
@@ -1788,16 +1841,17 @@
             <w:pPr>
               <w:spacing w:after="0"/>
               <w:jc w:val="left"/>
+              <w:rPr>
+                <w:rFonts w:hint="default"/>
+                <w:lang w:val="en-GB"/>
+              </w:rPr>
             </w:pPr>
             <w:r>
               <w:rPr>
-                <w:rFonts w:ascii="Calibri" w:hAnsi="Calibri" w:eastAsia="Calibri"/>
-                <w:b w:val="0"/>
-                <w:i w:val="0"/>
-                <w:color w:val="222222"/>
-                <w:sz w:val="20"/>
+                <w:rFonts w:hint="default"/>
+                <w:lang w:val="en-GB"/>
               </w:rPr>
-              <w:t>The item key</w:t>
+              <w:t>Only real words included in this dataset</w:t>
             </w:r>
           </w:p>
         </w:tc>
@@ -1812,6 +1866,12 @@
             <w:insideH w:val="single" w:color="auto" w:sz="4" w:space="0"/>
             <w:insideV w:val="single" w:color="auto" w:sz="4" w:space="0"/>
           </w:tblBorders>
+          <w:tblCellMar>
+            <w:top w:w="0" w:type="dxa"/>
+            <w:left w:w="108" w:type="dxa"/>
+            <w:bottom w:w="0" w:type="dxa"/>
+            <w:right w:w="108" w:type="dxa"/>
+          </w:tblCellMar>
         </w:tblPrEx>
         <w:trPr>
           <w:jc w:val="center"/>
@@ -1932,6 +1992,12 @@
             <w:insideH w:val="single" w:color="auto" w:sz="4" w:space="0"/>
             <w:insideV w:val="single" w:color="auto" w:sz="4" w:space="0"/>
           </w:tblBorders>
+          <w:tblCellMar>
+            <w:top w:w="0" w:type="dxa"/>
+            <w:left w:w="108" w:type="dxa"/>
+            <w:bottom w:w="0" w:type="dxa"/>
+            <w:right w:w="108" w:type="dxa"/>
+          </w:tblCellMar>
         </w:tblPrEx>
         <w:trPr>
           <w:jc w:val="center"/>
@@ -2052,6 +2118,12 @@
             <w:insideH w:val="single" w:color="auto" w:sz="4" w:space="0"/>
             <w:insideV w:val="single" w:color="auto" w:sz="4" w:space="0"/>
           </w:tblBorders>
+          <w:tblCellMar>
+            <w:top w:w="0" w:type="dxa"/>
+            <w:left w:w="108" w:type="dxa"/>
+            <w:bottom w:w="0" w:type="dxa"/>
+            <w:right w:w="108" w:type="dxa"/>
+          </w:tblCellMar>
         </w:tblPrEx>
         <w:trPr>
           <w:jc w:val="center"/>
@@ -2172,6 +2244,12 @@
             <w:insideH w:val="single" w:color="auto" w:sz="4" w:space="0"/>
             <w:insideV w:val="single" w:color="auto" w:sz="4" w:space="0"/>
           </w:tblBorders>
+          <w:tblCellMar>
+            <w:top w:w="0" w:type="dxa"/>
+            <w:left w:w="108" w:type="dxa"/>
+            <w:bottom w:w="0" w:type="dxa"/>
+            <w:right w:w="108" w:type="dxa"/>
+          </w:tblCellMar>
         </w:tblPrEx>
         <w:trPr>
           <w:jc w:val="center"/>
@@ -2412,6 +2490,12 @@
             <w:insideH w:val="single" w:color="auto" w:sz="4" w:space="0"/>
             <w:insideV w:val="single" w:color="auto" w:sz="4" w:space="0"/>
           </w:tblBorders>
+          <w:tblCellMar>
+            <w:top w:w="0" w:type="dxa"/>
+            <w:left w:w="108" w:type="dxa"/>
+            <w:bottom w:w="0" w:type="dxa"/>
+            <w:right w:w="108" w:type="dxa"/>
+          </w:tblCellMar>
         </w:tblPrEx>
         <w:trPr>
           <w:jc w:val="center"/>
@@ -2508,6 +2592,10 @@
             <w:pPr>
               <w:spacing w:after="0"/>
               <w:jc w:val="left"/>
+              <w:rPr>
+                <w:rFonts w:hint="default"/>
+                <w:lang w:val="en-GB"/>
+              </w:rPr>
             </w:pPr>
             <w:r>
               <w:rPr>
@@ -2517,7 +2605,18 @@
                 <w:color w:val="222222"/>
                 <w:sz w:val="20"/>
               </w:rPr>
-              <w:t>Useful descriptively, not part of the core model</w:t>
+              <w:t>Useful descriptively</w:t>
+            </w:r>
+            <w:r>
+              <w:rPr>
+                <w:rFonts w:hint="default" w:eastAsia="Calibri"/>
+                <w:b w:val="0"/>
+                <w:i w:val="0"/>
+                <w:color w:val="222222"/>
+                <w:sz w:val="20"/>
+                <w:lang w:val="en-GB"/>
+              </w:rPr>
+              <w:t>, but not our focus</w:t>
             </w:r>
           </w:p>
         </w:tc>
@@ -2525,7 +2624,7 @@
     </w:tbl>
     <w:p>
       <w:pPr>
-        <w:pStyle w:val="164"/>
+        <w:pStyle w:val="165"/>
       </w:pPr>
     </w:p>
     <w:tbl>
@@ -2586,7 +2685,75 @@
                 <w:rFonts w:hint="default"/>
                 <w:lang w:val="en-GB"/>
               </w:rPr>
-              <w:t>You can use the internet to search more about what these predictors are about (e.g. AoA and OLD20)</w:t>
+              <w:t>You can use the internet to search more about what these predictors if you are unfamiliar with them?</w:t>
+            </w:r>
+          </w:p>
+          <w:p>
+            <w:pPr>
+              <w:spacing w:after="0"/>
+              <w:rPr>
+                <w:rFonts w:hint="default"/>
+                <w:lang w:val="en-GB"/>
+              </w:rPr>
+            </w:pPr>
+            <w:r>
+              <w:rPr>
+                <w:rFonts w:hint="default"/>
+                <w:i/>
+                <w:iCs/>
+                <w:lang w:val="en-GB"/>
+              </w:rPr>
+              <w:br w:type="textWrapping"/>
+            </w:r>
+            <w:r>
+              <w:rPr>
+                <w:rFonts w:hint="default"/>
+                <w:i/>
+                <w:iCs/>
+                <w:lang w:val="en-GB"/>
+              </w:rPr>
+              <w:t>What is  AoA?</w:t>
+            </w:r>
+            <w:r>
+              <w:rPr>
+                <w:rFonts w:hint="default"/>
+                <w:i/>
+                <w:iCs/>
+                <w:lang w:val="en-GB"/>
+              </w:rPr>
+              <w:br w:type="textWrapping"/>
+            </w:r>
+            <w:r>
+              <w:rPr>
+                <w:rFonts w:hint="default"/>
+                <w:i/>
+                <w:iCs/>
+                <w:lang w:val="en-GB"/>
+              </w:rPr>
+              <w:t>What is OLD20?</w:t>
+            </w:r>
+            <w:r>
+              <w:rPr>
+                <w:rFonts w:hint="default"/>
+                <w:i/>
+                <w:iCs/>
+                <w:lang w:val="en-GB"/>
+              </w:rPr>
+              <w:br w:type="textWrapping"/>
+            </w:r>
+            <w:r>
+              <w:rPr>
+                <w:rFonts w:hint="default"/>
+                <w:lang w:val="en-GB"/>
+              </w:rPr>
+              <w:br w:type="textWrapping"/>
+            </w:r>
+            <w:r>
+              <w:rPr>
+                <w:rFonts w:hint="default"/>
+                <w:lang w:val="en-GB"/>
+              </w:rPr>
+              <w:t>And why might they predict lexical decision Reaction Time (RT)?</w:t>
             </w:r>
           </w:p>
         </w:tc>
@@ -2594,12 +2761,12 @@
     </w:tbl>
     <w:p>
       <w:pPr>
-        <w:pStyle w:val="164"/>
+        <w:pStyle w:val="165"/>
       </w:pPr>
     </w:p>
     <w:p>
       <w:pPr>
-        <w:pStyle w:val="165"/>
+        <w:pStyle w:val="166"/>
       </w:pPr>
       <w:r>
         <w:t>3. Download and open the file</w:t>
@@ -2627,7 +2794,7 @@
           <w:color w:val="222222"/>
           <w:sz w:val="21"/>
         </w:rPr>
-        <w:t>Open the GitHub repository link your tutor provides.</w:t>
+        <w:t>Open the GitHub repository link</w:t>
       </w:r>
     </w:p>
     <w:p>
@@ -2780,6 +2947,14 @@
         <w:gridCol w:w="9866"/>
       </w:tblGrid>
       <w:tr>
+        <w:tblPrEx>
+          <w:tblCellMar>
+            <w:top w:w="0" w:type="dxa"/>
+            <w:left w:w="108" w:type="dxa"/>
+            <w:bottom w:w="0" w:type="dxa"/>
+            <w:right w:w="108" w:type="dxa"/>
+          </w:tblCellMar>
+        </w:tblPrEx>
         <w:trPr>
           <w:jc w:val="center"/>
         </w:trPr>
@@ -2835,7 +3010,6 @@
               </w:rPr>
               <w:br w:type="textWrapping"/>
             </w:r>
-            <w:bookmarkStart w:id="0" w:name="_GoBack"/>
             <w:r>
               <w:rPr>
                 <w:rFonts w:hint="default" w:ascii="Calibri" w:hAnsi="Calibri" w:eastAsia="Calibri"/>
@@ -2846,19 +3020,18 @@
               </w:rPr>
               <w:t>https://github.com/shanelindsay/psylang-word-processing-workshop</w:t>
             </w:r>
-            <w:bookmarkEnd w:id="0"/>
           </w:p>
         </w:tc>
       </w:tr>
     </w:tbl>
     <w:p>
       <w:pPr>
-        <w:pStyle w:val="164"/>
+        <w:pStyle w:val="165"/>
       </w:pPr>
     </w:p>
     <w:p>
       <w:pPr>
-        <w:pStyle w:val="165"/>
+        <w:pStyle w:val="166"/>
       </w:pPr>
       <w:r>
         <w:t>4. Before you analyse, make some bets</w:t>
@@ -2869,9 +3042,24 @@
         <w:t>Do this before you run the full model. It is easier to understand the output when you have already committed to a prediction.</w:t>
       </w:r>
     </w:p>
+    <w:p>
+      <w:pPr>
+        <w:rPr>
+          <w:rFonts w:hint="default"/>
+          <w:lang w:val="en-GB"/>
+        </w:rPr>
+      </w:pPr>
+      <w:r>
+        <w:rPr>
+          <w:rFonts w:hint="default"/>
+          <w:lang w:val="en-GB"/>
+        </w:rPr>
+        <w:t xml:space="preserve">Consider for each predictor the direction of the prediction. Look at the raw data to make more sense of the numbers - i.e. what high vs. low means for each variable. Then consider why this variable might be predictive on lexical decision and your confidence that this will occur - where 5 is very confident and 1 not all confident (just guessing). </w:t>
+      </w:r>
+    </w:p>
     <w:tbl>
       <w:tblPr>
-        <w:tblStyle w:val="35"/>
+        <w:tblStyle w:val="36"/>
         <w:tblW w:w="0" w:type="auto"/>
         <w:jc w:val="center"/>
         <w:tblBorders>
@@ -3693,72 +3881,12 @@
     </w:tbl>
     <w:p>
       <w:pPr>
-        <w:pStyle w:val="164"/>
-      </w:pPr>
-    </w:p>
-    <w:tbl>
-      <w:tblPr>
-        <w:tblStyle w:val="12"/>
-        <w:tblW w:w="0" w:type="auto"/>
-        <w:jc w:val="center"/>
-        <w:tblLayout w:type="fixed"/>
-        <w:tblCellMar>
-          <w:top w:w="0" w:type="dxa"/>
-          <w:left w:w="108" w:type="dxa"/>
-          <w:bottom w:w="0" w:type="dxa"/>
-          <w:right w:w="108" w:type="dxa"/>
-        </w:tblCellMar>
-      </w:tblPr>
-      <w:tblGrid>
-        <w:gridCol w:w="9866"/>
-      </w:tblGrid>
-      <w:tr>
-        <w:trPr>
-          <w:jc w:val="center"/>
-        </w:trPr>
-        <w:tc>
-          <w:tcPr>
-            <w:tcW w:w="9638" w:type="dxa"/>
-            <w:tcBorders>
-              <w:top w:val="single" w:color="D6E2EB" w:sz="8" w:space="0"/>
-              <w:left w:val="single" w:color="D6E2EB" w:sz="8" w:space="0"/>
-              <w:bottom w:val="single" w:color="D6E2EB" w:sz="8" w:space="0"/>
-              <w:right w:val="single" w:color="D6E2EB" w:sz="8" w:space="0"/>
-            </w:tcBorders>
-            <w:shd w:val="clear" w:color="auto" w:fill="F6FAFD"/>
-            <w:tcMar>
-              <w:top w:w="80" w:type="dxa"/>
-              <w:left w:w="110" w:type="dxa"/>
-              <w:bottom w:w="80" w:type="dxa"/>
-              <w:right w:w="110" w:type="dxa"/>
-            </w:tcMar>
-          </w:tcPr>
-          <w:p>
-            <w:pPr>
-              <w:spacing w:after="0"/>
-            </w:pPr>
-            <w:r>
-              <w:rPr>
-                <w:rFonts w:ascii="Calibri" w:hAnsi="Calibri" w:eastAsia="Calibri"/>
-                <w:b w:val="0"/>
-                <w:i w:val="0"/>
-                <w:color w:val="222222"/>
-                <w:sz w:val="20"/>
-              </w:rPr>
-              <w:t>Pair prompt: Which do you think will survive in the final model after frequency is included? AoA, length, OLD20, more than one, or none?</w:t>
-            </w:r>
-          </w:p>
-        </w:tc>
-      </w:tr>
-    </w:tbl>
-    <w:p>
-      <w:pPr>
-        <w:pStyle w:val="164"/>
+        <w:pStyle w:val="165"/>
       </w:pPr>
     </w:p>
     <w:p>
       <w:pPr>
-        <w:pStyle w:val="165"/>
+        <w:pStyle w:val="166"/>
       </w:pPr>
       <w:r>
         <w:t>5. First look at the data</w:t>
@@ -3767,6 +3895,10 @@
     <w:p>
       <w:pPr>
         <w:ind w:left="312" w:hanging="255"/>
+        <w:rPr>
+          <w:rFonts w:hint="default"/>
+          <w:lang w:val="en-GB"/>
+        </w:rPr>
       </w:pPr>
       <w:r>
         <w:rPr>
@@ -3780,6 +3912,17 @@
       </w:r>
       <w:r>
         <w:rPr>
+          <w:rFonts w:hint="default" w:eastAsia="Calibri"/>
+          <w:b/>
+          <w:i w:val="0"/>
+          <w:color w:val="2F6E9E"/>
+          <w:sz w:val="21"/>
+          <w:lang w:val="en-GB"/>
+        </w:rPr>
+        <w:t xml:space="preserve">In Jamovi, </w:t>
+      </w:r>
+      <w:r>
+        <w:rPr>
           <w:rFonts w:ascii="Calibri" w:hAnsi="Calibri" w:eastAsia="Calibri"/>
           <w:b w:val="0"/>
           <w:i w:val="0"/>
@@ -3787,6 +3930,17 @@
           <w:sz w:val="21"/>
         </w:rPr>
         <w:t>Run descriptives for mean_RT_ms, length, log_frequency, AoA, and OLD20.</w:t>
+      </w:r>
+      <w:r>
+        <w:rPr>
+          <w:rFonts w:hint="default" w:eastAsia="Calibri"/>
+          <w:b w:val="0"/>
+          <w:i w:val="0"/>
+          <w:color w:val="222222"/>
+          <w:sz w:val="21"/>
+          <w:lang w:val="en-GB"/>
+        </w:rPr>
+        <w:t xml:space="preserve"> Histograms are very useful here. </w:t>
       </w:r>
     </w:p>
     <w:p>
@@ -3832,6 +3986,14 @@
     <w:p>
       <w:pPr>
         <w:ind w:left="312" w:hanging="255"/>
+        <w:rPr>
+          <w:rFonts w:hint="default" w:eastAsia="Calibri"/>
+          <w:b w:val="0"/>
+          <w:i w:val="0"/>
+          <w:color w:val="222222"/>
+          <w:sz w:val="21"/>
+          <w:lang w:val="en-GB"/>
+        </w:rPr>
       </w:pPr>
       <w:r>
         <w:rPr>
@@ -3852,6 +4014,17 @@
           <w:sz w:val="21"/>
         </w:rPr>
         <w:t>Look at missing values and anything implausible.</w:t>
+      </w:r>
+      <w:r>
+        <w:rPr>
+          <w:rFonts w:hint="default" w:eastAsia="Calibri"/>
+          <w:b w:val="0"/>
+          <w:i w:val="0"/>
+          <w:color w:val="222222"/>
+          <w:sz w:val="21"/>
+          <w:lang w:val="en-GB"/>
+        </w:rPr>
+        <w:t xml:space="preserve"> Consider the natural limits of the data - e.g. frequency cannot be less than zero. </w:t>
       </w:r>
     </w:p>
     <w:p>
@@ -3986,24 +4159,12 @@
                 <w:color w:val="222222"/>
                 <w:sz w:val="20"/>
               </w:rPr>
-              <w:t>Do more frequent words appear faster on the scatterplot?</w:t>
+              <w:t>Do any variables look especially skewed or unusual?</w:t>
             </w:r>
           </w:p>
           <w:p>
             <w:pPr>
               <w:ind w:left="170" w:hanging="142"/>
-            </w:pPr>
-            <w:r>
-              <w:rPr>
-                <w:rFonts w:ascii="Calibri" w:hAnsi="Calibri" w:eastAsia="Calibri"/>
-                <w:b/>
-                <w:i w:val="0"/>
-                <w:color w:val="2F6E9E"/>
-                <w:sz w:val="20"/>
-              </w:rPr>
-              <w:t xml:space="preserve">• </w:t>
-            </w:r>
-            <w:r>
               <w:rPr>
                 <w:rFonts w:ascii="Calibri" w:hAnsi="Calibri" w:eastAsia="Calibri"/>
                 <w:b w:val="0"/>
@@ -4011,12 +4172,6 @@
                 <w:color w:val="222222"/>
                 <w:sz w:val="20"/>
               </w:rPr>
-              <w:t>Do any variables look especially skewed or unusual?</w:t>
-            </w:r>
-          </w:p>
-          <w:p>
-            <w:pPr>
-              <w:ind w:left="170" w:hanging="142"/>
             </w:pPr>
             <w:r>
               <w:rPr>
@@ -4039,17 +4194,86 @@
               <w:t>Are there missing values you need to keep in mind?</w:t>
             </w:r>
           </w:p>
+          <w:p>
+            <w:pPr>
+              <w:ind w:left="170" w:hanging="142"/>
+            </w:pPr>
+            <w:r>
+              <w:rPr>
+                <w:rFonts w:ascii="Calibri" w:hAnsi="Calibri" w:eastAsia="Calibri"/>
+                <w:b w:val="0"/>
+                <w:i w:val="0"/>
+                <w:color w:val="222222"/>
+                <w:sz w:val="20"/>
+              </w:rPr>
+              <w:t xml:space="preserve">Do more frequent words appear </w:t>
+            </w:r>
+            <w:r>
+              <w:rPr>
+                <w:rFonts w:hint="default" w:eastAsia="Calibri"/>
+                <w:b w:val="0"/>
+                <w:i w:val="0"/>
+                <w:color w:val="222222"/>
+                <w:sz w:val="20"/>
+                <w:lang w:val="en-GB"/>
+              </w:rPr>
+              <w:t xml:space="preserve">to lead to </w:t>
+            </w:r>
+            <w:r>
+              <w:rPr>
+                <w:rFonts w:ascii="Calibri" w:hAnsi="Calibri" w:eastAsia="Calibri"/>
+                <w:b w:val="0"/>
+                <w:i w:val="0"/>
+                <w:color w:val="222222"/>
+                <w:sz w:val="20"/>
+              </w:rPr>
+              <w:t xml:space="preserve">faster </w:t>
+            </w:r>
+            <w:r>
+              <w:rPr>
+                <w:rFonts w:hint="default" w:eastAsia="Calibri"/>
+                <w:b w:val="0"/>
+                <w:i w:val="0"/>
+                <w:color w:val="222222"/>
+                <w:sz w:val="20"/>
+                <w:lang w:val="en-GB"/>
+              </w:rPr>
+              <w:t xml:space="preserve">decisions </w:t>
+            </w:r>
+            <w:r>
+              <w:rPr>
+                <w:rFonts w:ascii="Calibri" w:hAnsi="Calibri" w:eastAsia="Calibri"/>
+                <w:b w:val="0"/>
+                <w:i w:val="0"/>
+                <w:color w:val="222222"/>
+                <w:sz w:val="20"/>
+              </w:rPr>
+              <w:t>on the scatterplot?</w:t>
+            </w:r>
+          </w:p>
+          <w:p>
+            <w:pPr>
+              <w:ind w:left="170" w:hanging="142"/>
+              <w:rPr>
+                <w:rFonts w:ascii="Calibri" w:hAnsi="Calibri" w:eastAsia="Calibri"/>
+                <w:b w:val="0"/>
+                <w:i w:val="0"/>
+                <w:color w:val="222222"/>
+                <w:sz w:val="20"/>
+              </w:rPr>
+            </w:pPr>
+          </w:p>
         </w:tc>
       </w:tr>
     </w:tbl>
     <w:p>
       <w:pPr>
-        <w:pStyle w:val="164"/>
+        <w:pStyle w:val="165"/>
       </w:pPr>
     </w:p>
     <w:tbl>
       <w:tblPr>
-        <w:tblStyle w:val="35"/>
+        <w:tblStyle w:val="36"/>
         <w:tblW w:w="0" w:type="auto"/>
         <w:jc w:val="center"/>
         <w:tblBorders>
@@ -5055,12 +5279,12 @@
     </w:tbl>
     <w:p>
       <w:pPr>
-        <w:pStyle w:val="164"/>
+        <w:pStyle w:val="165"/>
       </w:pPr>
     </w:p>
     <w:p>
       <w:pPr>
-        <w:pStyle w:val="165"/>
+        <w:pStyle w:val="166"/>
       </w:pPr>
       <w:r>
         <w:t>6. Bridge to regression with one simple relation</w:t>
@@ -5163,7 +5387,7 @@
     </w:p>
     <w:p>
       <w:pPr>
-        <w:pStyle w:val="165"/>
+        <w:pStyle w:val="166"/>
       </w:pPr>
       <w:r>
         <w:t>7. Build the model in stages</w:t>
@@ -5171,7 +5395,7 @@
     </w:p>
     <w:tbl>
       <w:tblPr>
-        <w:tblStyle w:val="35"/>
+        <w:tblStyle w:val="36"/>
         <w:tblW w:w="0" w:type="auto"/>
         <w:jc w:val="center"/>
         <w:tblBorders>
@@ -5458,12 +5682,6 @@
             <w:insideH w:val="single" w:color="auto" w:sz="4" w:space="0"/>
             <w:insideV w:val="single" w:color="auto" w:sz="4" w:space="0"/>
           </w:tblBorders>
-          <w:tblCellMar>
-            <w:top w:w="0" w:type="dxa"/>
-            <w:left w:w="108" w:type="dxa"/>
-            <w:bottom w:w="0" w:type="dxa"/>
-            <w:right w:w="108" w:type="dxa"/>
-          </w:tblCellMar>
         </w:tblPrEx>
         <w:trPr>
           <w:jc w:val="center"/>
@@ -5829,17 +6047,67 @@
     </w:tbl>
     <w:p>
       <w:pPr>
-        <w:pStyle w:val="164"/>
+        <w:pStyle w:val="165"/>
       </w:pPr>
     </w:p>
     <w:p>
+      <w:pPr>
+        <w:rPr>
+          <w:rFonts w:hint="default"/>
+          <w:lang w:val="en-GB"/>
+        </w:rPr>
+      </w:pPr>
       <w:r>
-        <w:t>In Jamovi, go to Analyses &gt; Regression &gt; Linear Regression. Set mean_RT_ms as the dependent variable. Add predictors in blocks if your version is set up for model comparison. Request model fit, coefficients, and 95% confidence intervals. If available, also request standardised estimates. If you have time, look at collinearity statistics.</w:t>
+        <w:t>In Jamovi, go to Analyses &gt; Regression &gt; Linear Regression. Set mean_RT_ms as the dependent variable</w:t>
+      </w:r>
+      <w:r>
+        <w:rPr>
+          <w:rFonts w:hint="default"/>
+          <w:lang w:val="en-GB"/>
+        </w:rPr>
+        <w:t xml:space="preserve">, and start with the simplest model. Then build up the models one by one. </w:t>
+      </w:r>
+      <w:r>
+        <w:t xml:space="preserve"> </w:t>
+      </w:r>
+      <w:r>
+        <w:rPr>
+          <w:rFonts w:hint="default"/>
+          <w:lang w:val="en-GB"/>
+        </w:rPr>
+        <w:t xml:space="preserve">Start with the simplest mode, and observe changes to the R² across the models, and how much it changes. </w:t>
+      </w:r>
+    </w:p>
+    <w:p>
+      <w:pPr>
+        <w:rPr>
+          <w:rFonts w:hint="default"/>
+          <w:lang w:val="en-GB"/>
+        </w:rPr>
+      </w:pPr>
+      <w:r>
+        <w:rPr>
+          <w:rFonts w:hint="default"/>
+          <w:lang w:val="en-GB"/>
+        </w:rPr>
+        <w:t>If you want to go the more complicated route, you can use the build model feature in Jamovi, but if you want to keep things simple, just do each model manually and note the changes below.</w:t>
+      </w:r>
+    </w:p>
+    <w:p>
+      <w:r>
+        <w:rPr>
+          <w:rFonts w:hint="default"/>
+          <w:lang w:val="en-GB"/>
+        </w:rPr>
+        <w:t xml:space="preserve">From the standardised section, tick the box for </w:t>
+      </w:r>
+      <w:r>
+        <w:t xml:space="preserve">standardised estimates. </w:t>
       </w:r>
     </w:p>
     <w:tbl>
       <w:tblPr>
-        <w:tblStyle w:val="35"/>
+        <w:tblStyle w:val="36"/>
         <w:tblW w:w="0" w:type="auto"/>
         <w:jc w:val="center"/>
         <w:tblBorders>
@@ -5986,7 +6254,28 @@
                 <w:color w:val="FFFFFF"/>
                 <w:sz w:val="19"/>
               </w:rPr>
-              <w:t>What changed?</w:t>
+              <w:t>R²</w:t>
+            </w:r>
+            <w:r>
+              <w:rPr>
+                <w:rFonts w:hint="default" w:eastAsia="Calibri"/>
+                <w:b/>
+                <w:i w:val="0"/>
+                <w:color w:val="FFFFFF"/>
+                <w:sz w:val="19"/>
+                <w:lang w:val="en-GB"/>
+              </w:rPr>
+              <w:t xml:space="preserve"> </w:t>
+            </w:r>
+            <w:r>
+              <w:rPr>
+                <w:rFonts w:ascii="Calibri" w:hAnsi="Calibri" w:eastAsia="Calibri"/>
+                <w:b/>
+                <w:i w:val="0"/>
+                <w:color w:val="FFFFFF"/>
+                <w:sz w:val="19"/>
+              </w:rPr>
+              <w:t>change?</w:t>
             </w:r>
           </w:p>
         </w:tc>
@@ -6012,16 +6301,21 @@
             <w:pPr>
               <w:spacing w:after="0"/>
               <w:jc w:val="center"/>
+              <w:rPr>
+                <w:rFonts w:hint="default"/>
+                <w:lang w:val="en-GB"/>
+              </w:rPr>
             </w:pPr>
             <w:r>
               <w:rPr>
-                <w:rFonts w:ascii="Calibri" w:hAnsi="Calibri" w:eastAsia="Calibri"/>
+                <w:rFonts w:hint="default" w:eastAsia="Calibri"/>
                 <w:b/>
                 <w:i w:val="0"/>
                 <w:color w:val="FFFFFF"/>
                 <w:sz w:val="19"/>
+                <w:lang w:val="en-GB"/>
               </w:rPr>
-              <w:t>My note</w:t>
+              <w:t>Notes</w:t>
             </w:r>
           </w:p>
         </w:tc>
@@ -6128,7 +6422,18 @@
             <w:pPr>
               <w:spacing w:after="0"/>
               <w:jc w:val="left"/>
+              <w:rPr>
+                <w:rFonts w:hint="default"/>
+                <w:lang w:val="en-GB"/>
+              </w:rPr>
             </w:pPr>
+            <w:r>
+              <w:rPr>
+                <w:rFonts w:hint="default"/>
+                <w:lang w:val="en-GB"/>
+              </w:rPr>
+              <w:t>N/A</w:t>
+            </w:r>
           </w:p>
         </w:tc>
         <w:tc>
@@ -6547,31 +6852,89 @@
     </w:tbl>
     <w:p>
       <w:pPr>
-        <w:pStyle w:val="164"/>
+        <w:pStyle w:val="165"/>
       </w:pPr>
     </w:p>
     <w:p>
       <w:pPr>
-        <w:pStyle w:val="165"/>
+        <w:pStyle w:val="166"/>
         <w:rPr>
           <w:rFonts w:hint="default"/>
           <w:lang w:val="en-GB"/>
         </w:rPr>
       </w:pPr>
       <w:r>
-        <w:t>8. What counts as support</w:t>
+        <w:t xml:space="preserve">8. </w:t>
       </w:r>
       <w:r>
         <w:rPr>
           <w:rFonts w:hint="default"/>
           <w:lang w:val="en-GB"/>
         </w:rPr>
-        <w:t>?</w:t>
+        <w:t xml:space="preserve">Record your results. </w:t>
       </w:r>
     </w:p>
     <w:p>
+      <w:pPr>
+        <w:rPr>
+          <w:rFonts w:hint="default"/>
+          <w:lang w:val="en-GB"/>
+        </w:rPr>
+      </w:pPr>
       <w:r>
-        <w:t>Use the regression output to decide whether each predictor shows a unique association with mean lexical decision RT once the other predictors are included in the model.</w:t>
+        <w:t xml:space="preserve">Use the </w:t>
+      </w:r>
+      <w:r>
+        <w:rPr>
+          <w:rFonts w:hint="default"/>
+          <w:lang w:val="en-GB"/>
+        </w:rPr>
+        <w:t xml:space="preserve">final </w:t>
+      </w:r>
+      <w:r>
+        <w:t xml:space="preserve">regression output </w:t>
+      </w:r>
+      <w:r>
+        <w:rPr>
+          <w:rFonts w:hint="default"/>
+          <w:lang w:val="en-GB"/>
+        </w:rPr>
+        <w:t xml:space="preserve">(Model 4) </w:t>
+      </w:r>
+      <w:r>
+        <w:t>to decide whether each predictor shows a unique association with mean lexical decision RT once the other predictors are included in the model.</w:t>
+      </w:r>
+      <w:r>
+        <w:rPr>
+          <w:rFonts w:hint="default"/>
+          <w:lang w:val="en-GB"/>
+        </w:rPr>
+        <w:t xml:space="preserve"> Use sentence prose. </w:t>
+      </w:r>
+    </w:p>
+    <w:p>
+      <w:pPr>
+        <w:rPr>
+          <w:rFonts w:hint="default"/>
+          <w:lang w:val="en-GB"/>
+        </w:rPr>
+      </w:pPr>
+      <w:r>
+        <w:rPr>
+          <w:rFonts w:hint="default"/>
+          <w:lang w:val="en-GB"/>
+        </w:rPr>
+        <w:t xml:space="preserve">For the overall model, report the </w:t>
+      </w:r>
+      <w:r>
+        <w:t>R²</w:t>
+      </w:r>
+      <w:r>
+        <w:rPr>
+          <w:rFonts w:hint="default"/>
+          <w:lang w:val="en-GB"/>
+        </w:rPr>
+        <w:t>.</w:t>
       </w:r>
     </w:p>
     <w:p>
@@ -6599,192 +6962,20 @@
         <w:t>• the direction of the effect in plain language</w:t>
       </w:r>
     </w:p>
+    <w:p/>
     <w:p>
       <w:r>
         <w:t>Treat a predictor as supported only if the coefficient is in a meaningful direction and the regression output provides clear evidence for a unique effect once the other predictors are included.</w:t>
       </w:r>
     </w:p>
-    <w:p>
-      <w:pPr>
-        <w:pStyle w:val="164"/>
-      </w:pPr>
-    </w:p>
-    <w:p>
-      <w:pPr>
-        <w:pStyle w:val="165"/>
-      </w:pPr>
-      <w:r>
-        <w:t xml:space="preserve">9. Write your answer </w:t>
-      </w:r>
-    </w:p>
-    <w:p>
-      <w:r>
-        <w:t>Your answer should include:</w:t>
-      </w:r>
-    </w:p>
-    <w:p>
-      <w:pPr>
-        <w:rPr>
-          <w:rFonts w:hint="default"/>
-          <w:b/>
-          <w:bCs/>
-          <w:lang w:val="en-GB"/>
-        </w:rPr>
-      </w:pPr>
-      <w:r>
-        <w:rPr>
-          <w:rFonts w:hint="default"/>
-          <w:b/>
-          <w:bCs/>
-          <w:lang w:val="en-GB"/>
-        </w:rPr>
-        <w:t>Descriptives</w:t>
-      </w:r>
-    </w:p>
-    <w:p>
-      <w:r>
-        <w:t>• Summary statistics: M and SD for mean_RT_ms, length, log_frequency, AoA, and OLD20.</w:t>
-      </w:r>
-    </w:p>
-    <w:p>
-      <w:r>
-        <w:t>• Correlation: Pearson's r for log_frequency with AoA.</w:t>
-      </w:r>
-    </w:p>
-    <w:p>
-      <w:r>
-        <w:t>• Figure: a clearly labelled scatterplot showing the relation between mean_RT_ms and log_frequency, with a caption.</w:t>
-      </w:r>
-    </w:p>
-    <w:p>
-      <w:pPr>
-        <w:rPr>
-          <w:rFonts w:hint="default"/>
-          <w:b/>
-          <w:bCs/>
-          <w:lang w:val="en-GB"/>
-        </w:rPr>
-      </w:pPr>
-      <w:r>
-        <w:rPr>
-          <w:rFonts w:hint="default"/>
-          <w:b/>
-          <w:bCs/>
-          <w:lang w:val="en-GB"/>
-        </w:rPr>
-        <w:t xml:space="preserve">Inferential statistics </w:t>
-      </w:r>
-    </w:p>
-    <w:p>
-      <w:r>
-        <w:t>• Statistical test: the full multiple regression with length, log_frequency, AoA, and OLD20 entered together, plus R² (or adjusted R²) and b, SE, and p for each predictor.</w:t>
-      </w:r>
-    </w:p>
-    <w:p>
-      <w:r>
-        <w:t>Your interpretation should:</w:t>
-      </w:r>
-    </w:p>
-    <w:p>
-      <w:r>
-        <w:t>• explain the theoretical conclusion using the regression results</w:t>
-      </w:r>
-    </w:p>
-    <w:p>
-      <w:r>
-        <w:t>• give a plain-language summary of why some words are recognised faster than others</w:t>
-      </w:r>
-    </w:p>
-    <w:p>
-      <w:pPr>
-        <w:rPr>
-          <w:b/>
-          <w:bCs/>
-        </w:rPr>
-      </w:pPr>
-      <w:r>
-        <w:rPr>
-          <w:b/>
-          <w:bCs/>
-        </w:rPr>
-        <w:t>Sentence frame</w:t>
-      </w:r>
-      <w:r>
-        <w:rPr>
-          <w:rFonts w:hint="default"/>
-          <w:b/>
-          <w:bCs/>
-          <w:lang w:val="en-GB"/>
-        </w:rPr>
-        <w:t>s</w:t>
-      </w:r>
-      <w:r>
-        <w:rPr>
-          <w:b/>
-          <w:bCs/>
-        </w:rPr>
-        <w:t xml:space="preserve"> (optional):</w:t>
-      </w:r>
-    </w:p>
-    <w:p>
-      <w:r>
-        <w:t>• Descriptive statistics showed that ...</w:t>
-      </w:r>
-    </w:p>
-    <w:p>
-      <w:r>
-        <w:t>• The correlation between log_frequency and AoA was ...</w:t>
-      </w:r>
-    </w:p>
-    <w:p>
-      <w:r>
-        <w:t>• A multiple regression tested whether ...</w:t>
-      </w:r>
-    </w:p>
-    <w:p>
-      <w:r>
-        <w:t>• The model explained ...</w:t>
-      </w:r>
-    </w:p>
-    <w:p>
-      <w:r>
-        <w:t>• [Predictor] showed / did not show a unique effect ...</w:t>
-      </w:r>
-    </w:p>
-    <w:p>
-      <w:r>
-        <w:t>• Overall, the pattern suggests ...</w:t>
-      </w:r>
-    </w:p>
-    <w:p>
-      <w:r>
-        <w:rPr>
-          <w:rFonts w:hint="default"/>
-          <w:lang w:val="en-GB"/>
-        </w:rPr>
-        <w:t xml:space="preserve">For interpretation, you could also </w:t>
-      </w:r>
-      <w:r>
-        <w:t>state what lexical decision RT is generally taken to reflect, while noting that decision and response components may also contribute</w:t>
-      </w:r>
-      <w:r>
-        <w:rPr>
-          <w:rFonts w:hint="default"/>
-          <w:lang w:val="en-GB"/>
-        </w:rPr>
-        <w:t xml:space="preserve"> to RT - i.e. lexical decision is a “process pure” measure of lexical access.  </w:t>
-      </w:r>
-    </w:p>
-    <w:p>
-      <w:pPr>
-        <w:pStyle w:val="164"/>
-      </w:pPr>
-    </w:p>
+    <w:p/>
     <w:tbl>
       <w:tblPr>
         <w:tblStyle w:val="12"/>
+        <w:tblpPr w:leftFromText="180" w:rightFromText="180" w:vertAnchor="text" w:horzAnchor="page" w:tblpX="1126" w:tblpY="648"/>
+        <w:tblOverlap w:val="never"/>
         <w:tblW w:w="0" w:type="auto"/>
-        <w:jc w:val="center"/>
+        <w:tblInd w:w="0" w:type="dxa"/>
         <w:tblLayout w:type="fixed"/>
         <w:tblCellMar>
           <w:top w:w="0" w:type="dxa"/>
@@ -6805,12 +6996,9 @@
             <w:right w:w="108" w:type="dxa"/>
           </w:tblCellMar>
         </w:tblPrEx>
-        <w:trPr>
-          <w:jc w:val="center"/>
-        </w:trPr>
         <w:tc>
           <w:tcPr>
-            <w:tcW w:w="9638" w:type="dxa"/>
+            <w:tcW w:w="9866" w:type="dxa"/>
             <w:tcBorders>
               <w:top w:val="single" w:color="1F4E79" w:sz="10" w:space="0"/>
               <w:left w:val="single" w:color="1F4E79" w:sz="10" w:space="0"/>
@@ -6908,19 +7096,421 @@
         </w:tc>
       </w:tr>
     </w:tbl>
+    <w:p/>
     <w:p>
       <w:pPr>
-        <w:pStyle w:val="164"/>
+        <w:pStyle w:val="166"/>
+        <w:rPr>
+          <w:rFonts w:hint="default"/>
+          <w:lang w:val="en-GB"/>
+        </w:rPr>
       </w:pPr>
     </w:p>
     <w:p>
       <w:pPr>
-        <w:pStyle w:val="164"/>
+        <w:pStyle w:val="166"/>
+        <w:rPr>
+          <w:rFonts w:hint="default"/>
+          <w:lang w:val="en-GB"/>
+        </w:rPr>
+      </w:pPr>
+      <w:r>
+        <w:rPr>
+          <w:rFonts w:hint="default"/>
+          <w:lang w:val="en-GB"/>
+        </w:rPr>
+        <w:t>9</w:t>
+      </w:r>
+      <w:r>
+        <w:t xml:space="preserve">. </w:t>
+      </w:r>
+      <w:r>
+        <w:rPr>
+          <w:rFonts w:hint="default"/>
+        </w:rPr>
+        <w:t>Interpret the final model</w:t>
+      </w:r>
+    </w:p>
+    <w:p/>
+    <w:p>
+      <w:pPr>
+        <w:rPr>
+          <w:rFonts w:hint="default"/>
+        </w:rPr>
+      </w:pPr>
+      <w:r>
+        <w:rPr>
+          <w:rFonts w:hint="default"/>
+        </w:rPr>
+        <w:t>Using the results you recorded in Section 8, write a short paragraph in prose.</w:t>
+      </w:r>
+    </w:p>
+    <w:p>
+      <w:pPr>
+        <w:rPr>
+          <w:rFonts w:hint="default"/>
+        </w:rPr>
       </w:pPr>
     </w:p>
     <w:p>
       <w:pPr>
+        <w:rPr>
+          <w:rFonts w:hint="default"/>
+        </w:rPr>
+      </w:pPr>
+      <w:r>
+        <w:rPr>
+          <w:rFonts w:hint="default"/>
+        </w:rPr>
+        <w:t xml:space="preserve">Your </w:t>
+      </w:r>
+      <w:r>
+        <w:rPr>
+          <w:rFonts w:hint="default"/>
+          <w:lang w:val="en-GB"/>
+        </w:rPr>
+        <w:t xml:space="preserve">text </w:t>
+      </w:r>
+      <w:r>
+        <w:rPr>
+          <w:rFonts w:hint="default"/>
+        </w:rPr>
+        <w:t>should include:</w:t>
+      </w:r>
+    </w:p>
+    <w:p>
+      <w:pPr>
+        <w:numPr>
+          <w:ilvl w:val="0"/>
+          <w:numId w:val="7"/>
+        </w:numPr>
+        <w:ind w:left="420" w:leftChars="0" w:hanging="420" w:firstLineChars="0"/>
+        <w:rPr/>
+      </w:pPr>
+      <w:r>
+        <w:rPr>
+          <w:rFonts w:hint="default"/>
+        </w:rPr>
+        <w:t>one sentence reporting the overall model fit</w:t>
+      </w:r>
+    </w:p>
+    <w:p>
+      <w:pPr>
+        <w:numPr>
+          <w:ilvl w:val="0"/>
+          <w:numId w:val="7"/>
+        </w:numPr>
+        <w:ind w:left="420" w:leftChars="0" w:hanging="420" w:firstLineChars="0"/>
+        <w:rPr/>
+      </w:pPr>
+      <w:r>
+        <w:rPr>
+          <w:rFonts w:hint="default"/>
+        </w:rPr>
+        <w:t>one sentence reporting which predictors showed unique effects</w:t>
+      </w:r>
+    </w:p>
+    <w:p>
+      <w:pPr>
+        <w:numPr>
+          <w:ilvl w:val="0"/>
+          <w:numId w:val="7"/>
+        </w:numPr>
+        <w:ind w:left="420" w:leftChars="0" w:hanging="420" w:firstLineChars="0"/>
+        <w:rPr/>
+      </w:pPr>
+      <w:r>
+        <w:rPr>
+          <w:rFonts w:hint="default"/>
+        </w:rPr>
+        <w:t xml:space="preserve">one sentence stating whether the pattern supports </w:t>
+      </w:r>
+      <w:r>
+        <w:rPr>
+          <w:rFonts w:hint="default"/>
+          <w:lang w:val="en-GB"/>
+        </w:rPr>
+        <w:t xml:space="preserve">any particular account </w:t>
+      </w:r>
+    </w:p>
+    <w:p>
+      <w:pPr>
+        <w:numPr>
+          <w:ilvl w:val="0"/>
+          <w:numId w:val="7"/>
+        </w:numPr>
+        <w:ind w:left="420" w:leftChars="0" w:hanging="420" w:firstLineChars="0"/>
+        <w:rPr/>
+      </w:pPr>
+      <w:r>
+        <w:t>one sentence in plain language explaining why some words were recognised faster than others</w:t>
+      </w:r>
+    </w:p>
+    <w:p>
+      <w:pPr>
+        <w:numPr>
+          <w:ilvl w:val="0"/>
+          <w:numId w:val="7"/>
+        </w:numPr>
+        <w:ind w:left="420" w:leftChars="0" w:hanging="420" w:firstLineChars="0"/>
+        <w:rPr/>
+      </w:pPr>
+      <w:r>
+        <w:rPr>
+          <w:rFonts w:hint="default"/>
+        </w:rPr>
+        <w:t>one sentence stating what lexical decision RT is generally taken to reflect</w:t>
+      </w:r>
+    </w:p>
+    <w:p>
+      <w:pPr>
+        <w:rPr>
+          <w:b/>
+          <w:bCs/>
+        </w:rPr>
+      </w:pPr>
+    </w:p>
+    <w:p>
+      <w:pPr>
+        <w:rPr>
+          <w:b/>
+          <w:bCs/>
+        </w:rPr>
+      </w:pPr>
+      <w:r>
+        <w:rPr>
+          <w:b/>
+          <w:bCs/>
+        </w:rPr>
+        <w:t>Sentence frame</w:t>
+      </w:r>
+      <w:r>
+        <w:rPr>
+          <w:rFonts w:hint="default"/>
+          <w:b/>
+          <w:bCs/>
+          <w:lang w:val="en-GB"/>
+        </w:rPr>
+        <w:t>s</w:t>
+      </w:r>
+      <w:r>
+        <w:rPr>
+          <w:b/>
+          <w:bCs/>
+        </w:rPr>
+        <w:t xml:space="preserve"> (optional):</w:t>
+      </w:r>
+    </w:p>
+    <w:p>
+      <w:r>
+        <w:t>• Descriptive statistics showed that ...</w:t>
+      </w:r>
+    </w:p>
+    <w:p>
+      <w:r>
+        <w:t>• The correlation between log_frequency and AoA was ...</w:t>
+      </w:r>
+    </w:p>
+    <w:p>
+      <w:r>
+        <w:t>• A multiple regression tested whether ...</w:t>
+      </w:r>
+    </w:p>
+    <w:p>
+      <w:r>
+        <w:t>• AoA </w:t>
+      </w:r>
+      <w:r>
+        <w:rPr>
+          <w:rFonts w:hint="default"/>
+          <w:lang w:val="en-GB"/>
+        </w:rPr>
+        <w:t xml:space="preserve">(etc...) </w:t>
+      </w:r>
+      <w:r>
+        <w:rPr>
+          <w:rFonts w:hint="default"/>
+        </w:rPr>
+        <w:t>did / did not show a unique effect once the other predictors were included.</w:t>
+      </w:r>
+    </w:p>
+    <w:p>
+      <w:r>
+        <w:t>• The model explained ...</w:t>
+      </w:r>
+    </w:p>
+    <w:p>
+      <w:r>
+        <w:t>• [Predictor] showed / did not show a unique effect ...</w:t>
+      </w:r>
+    </w:p>
+    <w:p>
+      <w:r>
+        <w:t>• Overall, the pattern suggests ...</w:t>
+      </w:r>
+    </w:p>
+    <w:p>
+      <w:pPr>
         <w:pStyle w:val="165"/>
+      </w:pPr>
+    </w:p>
+    <w:tbl>
+      <w:tblPr>
+        <w:tblStyle w:val="12"/>
+        <w:tblW w:w="0" w:type="auto"/>
+        <w:jc w:val="center"/>
+        <w:tblLayout w:type="fixed"/>
+        <w:tblCellMar>
+          <w:top w:w="0" w:type="dxa"/>
+          <w:left w:w="108" w:type="dxa"/>
+          <w:bottom w:w="0" w:type="dxa"/>
+          <w:right w:w="108" w:type="dxa"/>
+        </w:tblCellMar>
+      </w:tblPr>
+      <w:tblGrid>
+        <w:gridCol w:w="9866"/>
+      </w:tblGrid>
+      <w:tr>
+        <w:tblPrEx>
+          <w:tblCellMar>
+            <w:top w:w="0" w:type="dxa"/>
+            <w:left w:w="108" w:type="dxa"/>
+            <w:bottom w:w="0" w:type="dxa"/>
+            <w:right w:w="108" w:type="dxa"/>
+          </w:tblCellMar>
+        </w:tblPrEx>
+        <w:trPr>
+          <w:jc w:val="center"/>
+        </w:trPr>
+        <w:tc>
+          <w:tcPr>
+            <w:tcW w:w="9638" w:type="dxa"/>
+            <w:tcBorders>
+              <w:top w:val="single" w:color="1F4E79" w:sz="10" w:space="0"/>
+              <w:left w:val="single" w:color="1F4E79" w:sz="10" w:space="0"/>
+              <w:bottom w:val="single" w:color="1F4E79" w:sz="10" w:space="0"/>
+              <w:right w:val="single" w:color="1F4E79" w:sz="10" w:space="0"/>
+            </w:tcBorders>
+            <w:shd w:val="clear" w:color="auto" w:fill="EAF2F8"/>
+            <w:tcMar>
+              <w:top w:w="110" w:type="dxa"/>
+              <w:left w:w="120" w:type="dxa"/>
+              <w:bottom w:w="110" w:type="dxa"/>
+              <w:right w:w="120" w:type="dxa"/>
+            </w:tcMar>
+          </w:tcPr>
+          <w:p>
+            <w:pPr>
+              <w:ind w:left="170" w:hanging="142"/>
+            </w:pPr>
+          </w:p>
+          <w:p>
+            <w:pPr>
+              <w:ind w:left="170" w:hanging="142"/>
+            </w:pPr>
+          </w:p>
+          <w:p>
+            <w:pPr>
+              <w:ind w:left="170" w:hanging="142"/>
+            </w:pPr>
+          </w:p>
+          <w:p>
+            <w:pPr>
+              <w:ind w:left="170" w:hanging="142"/>
+            </w:pPr>
+            <w:bookmarkStart w:id="0" w:name="_GoBack"/>
+            <w:bookmarkEnd w:id="0"/>
+          </w:p>
+          <w:p>
+            <w:pPr>
+              <w:ind w:left="170" w:hanging="142"/>
+            </w:pPr>
+          </w:p>
+          <w:p>
+            <w:pPr>
+              <w:ind w:left="170" w:hanging="142"/>
+            </w:pPr>
+          </w:p>
+          <w:p>
+            <w:pPr>
+              <w:ind w:left="170" w:hanging="142"/>
+            </w:pPr>
+          </w:p>
+          <w:p>
+            <w:pPr>
+              <w:ind w:left="170" w:hanging="142"/>
+            </w:pPr>
+          </w:p>
+          <w:p>
+            <w:pPr>
+              <w:ind w:left="170" w:hanging="142"/>
+            </w:pPr>
+          </w:p>
+          <w:p>
+            <w:pPr>
+              <w:ind w:left="170" w:hanging="142"/>
+            </w:pPr>
+          </w:p>
+          <w:p>
+            <w:pPr>
+              <w:ind w:left="170" w:hanging="142"/>
+            </w:pPr>
+          </w:p>
+          <w:p>
+            <w:pPr>
+              <w:ind w:left="170" w:hanging="142"/>
+            </w:pPr>
+          </w:p>
+          <w:p>
+            <w:pPr>
+              <w:ind w:left="170" w:hanging="142"/>
+            </w:pPr>
+          </w:p>
+          <w:p>
+            <w:pPr>
+              <w:ind w:left="170" w:hanging="142"/>
+            </w:pPr>
+          </w:p>
+          <w:p>
+            <w:pPr>
+              <w:ind w:left="170" w:hanging="142"/>
+            </w:pPr>
+          </w:p>
+          <w:p>
+            <w:pPr>
+              <w:ind w:left="170" w:hanging="142"/>
+            </w:pPr>
+          </w:p>
+        </w:tc>
+      </w:tr>
+    </w:tbl>
+    <w:p>
+      <w:pPr>
+        <w:pStyle w:val="165"/>
+      </w:pPr>
+    </w:p>
+    <w:p>
+      <w:r>
+        <w:rPr>
+          <w:rFonts w:hint="default"/>
+          <w:lang w:val="en-GB"/>
+        </w:rPr>
+        <w:t xml:space="preserve">For interpretation, you could also </w:t>
+      </w:r>
+      <w:r>
+        <w:t>state what lexical decision RT is generally taken to reflect, while noting that decision and response components may also contribute</w:t>
+      </w:r>
+      <w:r>
+        <w:rPr>
+          <w:rFonts w:hint="default"/>
+          <w:lang w:val="en-GB"/>
+        </w:rPr>
+        <w:t xml:space="preserve"> to RT - i.e. lexical decision is not a “process pure” measure of lexical access.  </w:t>
+      </w:r>
+    </w:p>
+    <w:p>
+      <w:pPr>
+        <w:pStyle w:val="166"/>
       </w:pPr>
       <w:r>
         <w:t>1</w:t>
@@ -6939,6 +7529,10 @@
     <w:p>
       <w:pPr>
         <w:ind w:left="255" w:hanging="198"/>
+        <w:rPr>
+          <w:rFonts w:hint="default"/>
+          <w:lang w:val="en-GB"/>
+        </w:rPr>
       </w:pPr>
       <w:r>
         <w:rPr>
@@ -6958,32 +7552,18 @@
           <w:color w:val="222222"/>
           <w:sz w:val="21"/>
         </w:rPr>
-        <w:t>Inspect mean_accuracy as a descriptive check.</w:t>
-      </w:r>
-    </w:p>
-    <w:p>
-      <w:pPr>
-        <w:ind w:left="255" w:hanging="198"/>
-      </w:pPr>
-      <w:r>
-        <w:rPr>
-          <w:rFonts w:ascii="Calibri" w:hAnsi="Calibri" w:eastAsia="Calibri"/>
-          <w:b/>
-          <w:i w:val="0"/>
-          <w:color w:val="2F6E9E"/>
-          <w:sz w:val="21"/>
-        </w:rPr>
-        <w:t xml:space="preserve">• </w:t>
+        <w:t>Inspect mean_accuracy as a descriptive chec</w:t>
       </w:r>
       <w:r>
         <w:rPr>
-          <w:rFonts w:ascii="Calibri" w:hAnsi="Calibri" w:eastAsia="Calibri"/>
+          <w:rFonts w:hint="default" w:eastAsia="Calibri"/>
           <w:b w:val="0"/>
           <w:i w:val="0"/>
           <w:color w:val="222222"/>
           <w:sz w:val="21"/>
+          <w:lang w:val="en-GB"/>
         </w:rPr>
-        <w:t>Compare OLD20 with orthographic_neighbourhood_n if that variable is present.</w:t>
+        <w:t>k. Look at the correlation with RT - is there a speed-accuracy tradeoff?</w:t>
       </w:r>
     </w:p>
     <w:p>
@@ -7022,17 +7602,6 @@
       <w:pPr>
         <w:ind w:left="255" w:hanging="198"/>
         <w:rPr>
-          <w:rFonts w:ascii="Calibri" w:hAnsi="Calibri" w:eastAsia="Calibri"/>
-          <w:b w:val="0"/>
-          <w:i w:val="0"/>
-          <w:color w:val="222222"/>
-          <w:sz w:val="21"/>
-        </w:rPr>
-      </w:pPr>
-    </w:p>
-    <w:p>
-      <w:pPr>
-        <w:rPr>
           <w:rFonts w:hint="default" w:eastAsia="Calibri"/>
           <w:b w:val="0"/>
           <w:i w:val="0"/>
@@ -7041,6 +7610,16 @@
           <w:lang w:val="en-GB"/>
         </w:rPr>
       </w:pPr>
+      <w:r>
+        <w:rPr>
+          <w:rFonts w:ascii="Calibri" w:hAnsi="Calibri" w:eastAsia="Calibri"/>
+          <w:b/>
+          <w:i w:val="0"/>
+          <w:color w:val="2F6E9E"/>
+          <w:sz w:val="21"/>
+        </w:rPr>
+        <w:t xml:space="preserve">• </w:t>
+      </w:r>
       <w:r>
         <w:rPr>
           <w:rFonts w:hint="default" w:eastAsia="Calibri"/>
@@ -7067,7 +7646,7 @@
     </w:p>
     <w:p>
       <w:pPr>
-        <w:pStyle w:val="165"/>
+        <w:pStyle w:val="166"/>
       </w:pPr>
       <w:r>
         <w:t>References</w:t>
@@ -7075,7 +7654,7 @@
     </w:p>
     <w:p>
       <w:pPr>
-        <w:pStyle w:val="167"/>
+        <w:pStyle w:val="168"/>
       </w:pPr>
       <w:r>
         <w:rPr>
@@ -7090,7 +7669,7 @@
     </w:p>
     <w:p>
       <w:pPr>
-        <w:pStyle w:val="167"/>
+        <w:pStyle w:val="168"/>
       </w:pPr>
       <w:r>
         <w:rPr>
@@ -7105,7 +7684,7 @@
     </w:p>
     <w:p>
       <w:pPr>
-        <w:pStyle w:val="167"/>
+        <w:pStyle w:val="168"/>
       </w:pPr>
       <w:r>
         <w:rPr>
@@ -7341,6 +7920,26 @@
       </w:rPr>
     </w:lvl>
   </w:abstractNum>
+  <w:abstractNum w:abstractNumId="6">
+    <w:nsid w:val="67E77DB7"/>
+    <w:multiLevelType w:val="singleLevel"/>
+    <w:tmpl w:val="67E77DB7"/>
+    <w:lvl w:ilvl="0" w:tentative="0">
+      <w:start w:val="1"/>
+      <w:numFmt w:val="bullet"/>
+      <w:lvlText w:val=""/>
+      <w:lvlJc w:val="left"/>
+      <w:pPr>
+        <w:tabs>
+          <w:tab w:val="left" w:pos="420"/>
+        </w:tabs>
+        <w:ind w:left="420" w:leftChars="0" w:hanging="420" w:firstLineChars="0"/>
+      </w:pPr>
+      <w:rPr>
+        <w:rFonts w:hint="default" w:ascii="Wingdings" w:hAnsi="Wingdings"/>
+      </w:rPr>
+    </w:lvl>
+  </w:abstractNum>
   <w:num w:numId="1">
     <w:abstractNumId w:val="5"/>
   </w:num>
@@ -7359,6 +7958,9 @@
   <w:num w:numId="6">
     <w:abstractNumId w:val="0"/>
   </w:num>
+  <w:num w:numId="7">
+    <w:abstractNumId w:val="6"/>
+  </w:num>
 </w:numbering>
 </file>
 
@@ -7367,7 +7969,7 @@
   <w:docDefaults>
     <w:rPrDefault>
       <w:rPr>
-        <w:rFonts w:asciiTheme="minorHAnsi" w:hAnsiTheme="minorHAnsi" w:eastAsiaTheme="minorEastAsia" w:cstheme="minorBidi"/>
+        <w:rFonts w:ascii="Times New Roman" w:hAnsi="Times New Roman" w:eastAsia="SimSun" w:cs="Times New Roman"/>
       </w:rPr>
     </w:rPrDefault>
     <w:pPrDefault/>
@@ -7645,7 +8247,7 @@
     <w:name w:val="heading 1"/>
     <w:basedOn w:val="1"/>
     <w:next w:val="1"/>
-    <w:link w:val="138"/>
+    <w:link w:val="139"/>
     <w:qFormat/>
     <w:uiPriority w:val="9"/>
     <w:pPr>
@@ -7667,7 +8269,7 @@
     <w:name w:val="heading 2"/>
     <w:basedOn w:val="1"/>
     <w:next w:val="1"/>
-    <w:link w:val="139"/>
+    <w:link w:val="140"/>
     <w:unhideWhenUsed/>
     <w:qFormat/>
     <w:uiPriority w:val="9"/>
@@ -7695,7 +8297,7 @@
     <w:name w:val="heading 3"/>
     <w:basedOn w:val="1"/>
     <w:next w:val="1"/>
-    <w:link w:val="140"/>
+    <w:link w:val="141"/>
     <w:unhideWhenUsed/>
     <w:qFormat/>
     <w:uiPriority w:val="9"/>
@@ -7721,7 +8323,7 @@
     <w:name w:val="heading 4"/>
     <w:basedOn w:val="1"/>
     <w:next w:val="1"/>
-    <w:link w:val="150"/>
+    <w:link w:val="151"/>
     <w:semiHidden/>
     <w:unhideWhenUsed/>
     <w:qFormat/>
@@ -7750,7 +8352,7 @@
     <w:name w:val="heading 5"/>
     <w:basedOn w:val="1"/>
     <w:next w:val="1"/>
-    <w:link w:val="151"/>
+    <w:link w:val="152"/>
     <w:semiHidden/>
     <w:unhideWhenUsed/>
     <w:qFormat/>
@@ -7770,7 +8372,7 @@
     <w:name w:val="heading 6"/>
     <w:basedOn w:val="1"/>
     <w:next w:val="1"/>
-    <w:link w:val="152"/>
+    <w:link w:val="153"/>
     <w:semiHidden/>
     <w:unhideWhenUsed/>
     <w:qFormat/>
@@ -7792,7 +8394,7 @@
     <w:name w:val="heading 7"/>
     <w:basedOn w:val="1"/>
     <w:next w:val="1"/>
-    <w:link w:val="153"/>
+    <w:link w:val="154"/>
     <w:semiHidden/>
     <w:unhideWhenUsed/>
     <w:qFormat/>
@@ -7822,7 +8424,7 @@
     <w:name w:val="heading 8"/>
     <w:basedOn w:val="1"/>
     <w:next w:val="1"/>
-    <w:link w:val="154"/>
+    <w:link w:val="155"/>
     <w:semiHidden/>
     <w:unhideWhenUsed/>
     <w:qFormat/>
@@ -7849,7 +8451,7 @@
     <w:name w:val="heading 9"/>
     <w:basedOn w:val="1"/>
     <w:next w:val="1"/>
-    <w:link w:val="155"/>
+    <w:link w:val="156"/>
     <w:semiHidden/>
     <w:unhideWhenUsed/>
     <w:qFormat/>
@@ -7902,7 +8504,7 @@
   <w:style w:type="paragraph" w:styleId="13">
     <w:name w:val="Body Text"/>
     <w:basedOn w:val="1"/>
-    <w:link w:val="144"/>
+    <w:link w:val="145"/>
     <w:unhideWhenUsed/>
     <w:qFormat/>
     <w:uiPriority w:val="99"/>
@@ -7913,7 +8515,7 @@
   <w:style w:type="paragraph" w:styleId="14">
     <w:name w:val="Body Text 2"/>
     <w:basedOn w:val="1"/>
-    <w:link w:val="145"/>
+    <w:link w:val="146"/>
     <w:unhideWhenUsed/>
     <w:qFormat/>
     <w:uiPriority w:val="99"/>
@@ -7924,7 +8526,7 @@
   <w:style w:type="paragraph" w:styleId="15">
     <w:name w:val="Body Text 3"/>
     <w:basedOn w:val="1"/>
-    <w:link w:val="146"/>
+    <w:link w:val="147"/>
     <w:unhideWhenUsed/>
     <w:qFormat/>
     <w:uiPriority w:val="99"/>
@@ -7973,7 +8575,7 @@
   <w:style w:type="paragraph" w:styleId="18">
     <w:name w:val="footer"/>
     <w:basedOn w:val="1"/>
-    <w:link w:val="136"/>
+    <w:link w:val="137"/>
     <w:unhideWhenUsed/>
     <w:qFormat/>
     <w:uiPriority w:val="99"/>
@@ -7988,7 +8590,7 @@
   <w:style w:type="paragraph" w:styleId="19">
     <w:name w:val="header"/>
     <w:basedOn w:val="1"/>
-    <w:link w:val="135"/>
+    <w:link w:val="136"/>
     <w:unhideWhenUsed/>
     <w:qFormat/>
     <w:uiPriority w:val="99"/>
@@ -8155,7 +8757,7 @@
   </w:style>
   <w:style w:type="paragraph" w:styleId="32">
     <w:name w:val="macro"/>
-    <w:link w:val="147"/>
+    <w:link w:val="148"/>
     <w:unhideWhenUsed/>
     <w:qFormat/>
     <w:uiPriority w:val="99"/>
@@ -8178,7 +8780,18 @@
       <w:lang w:val="en-US" w:eastAsia="en-US" w:bidi="ar-SA"/>
     </w:rPr>
   </w:style>
-  <w:style w:type="character" w:styleId="33">
+  <w:style w:type="paragraph" w:styleId="33">
+    <w:name w:val="Normal (Web)"/>
+    <w:basedOn w:val="1"/>
+    <w:semiHidden/>
+    <w:unhideWhenUsed/>
+    <w:uiPriority w:val="99"/>
+    <w:rPr>
+      <w:sz w:val="24"/>
+      <w:szCs w:val="24"/>
+    </w:rPr>
+  </w:style>
+  <w:style w:type="character" w:styleId="34">
     <w:name w:val="Strong"/>
     <w:basedOn w:val="11"/>
     <w:qFormat/>
@@ -8188,11 +8801,11 @@
       <w:bCs/>
     </w:rPr>
   </w:style>
-  <w:style w:type="paragraph" w:styleId="34">
+  <w:style w:type="paragraph" w:styleId="35">
     <w:name w:val="Subtitle"/>
     <w:basedOn w:val="1"/>
     <w:next w:val="1"/>
-    <w:link w:val="142"/>
+    <w:link w:val="143"/>
     <w:qFormat/>
     <w:uiPriority w:val="11"/>
     <w:rPr>
@@ -8210,7 +8823,7 @@
       </w14:textFill>
     </w:rPr>
   </w:style>
-  <w:style w:type="table" w:styleId="35">
+  <w:style w:type="table" w:styleId="36">
     <w:name w:val="Table Grid"/>
     <w:basedOn w:val="12"/>
     <w:qFormat/>
@@ -8235,11 +8848,11 @@
       </w:tblCellMar>
     </w:tblPr>
   </w:style>
-  <w:style w:type="paragraph" w:styleId="36">
+  <w:style w:type="paragraph" w:styleId="37">
     <w:name w:val="Title"/>
     <w:basedOn w:val="1"/>
     <w:next w:val="1"/>
-    <w:link w:val="141"/>
+    <w:link w:val="142"/>
     <w:qFormat/>
     <w:uiPriority w:val="10"/>
     <w:pPr>
@@ -8258,7 +8871,7 @@
       <w:szCs w:val="52"/>
     </w:rPr>
   </w:style>
-  <w:style w:type="table" w:styleId="37">
+  <w:style w:type="table" w:styleId="38">
     <w:name w:val="Light Shading"/>
     <w:basedOn w:val="12"/>
     <w:qFormat/>
@@ -8358,7 +8971,7 @@
       </w:tcPr>
     </w:tblStylePr>
   </w:style>
-  <w:style w:type="table" w:styleId="38">
+  <w:style w:type="table" w:styleId="39">
     <w:name w:val="Light Shading Accent 1"/>
     <w:basedOn w:val="12"/>
     <w:qFormat/>
@@ -8458,7 +9071,7 @@
       </w:tcPr>
     </w:tblStylePr>
   </w:style>
-  <w:style w:type="table" w:styleId="39">
+  <w:style w:type="table" w:styleId="40">
     <w:name w:val="Light Shading Accent 2"/>
     <w:basedOn w:val="12"/>
     <w:qFormat/>
@@ -8558,7 +9171,7 @@
       </w:tcPr>
     </w:tblStylePr>
   </w:style>
-  <w:style w:type="table" w:styleId="40">
+  <w:style w:type="table" w:styleId="41">
     <w:name w:val="Light Shading Accent 3"/>
     <w:basedOn w:val="12"/>
     <w:qFormat/>
@@ -8658,7 +9271,7 @@
       </w:tcPr>
     </w:tblStylePr>
   </w:style>
-  <w:style w:type="table" w:styleId="41">
+  <w:style w:type="table" w:styleId="42">
     <w:name w:val="Light Shading Accent 4"/>
     <w:basedOn w:val="12"/>
     <w:qFormat/>
@@ -8758,7 +9371,7 @@
       </w:tcPr>
     </w:tblStylePr>
   </w:style>
-  <w:style w:type="table" w:styleId="42">
+  <w:style w:type="table" w:styleId="43">
     <w:name w:val="Light Shading Accent 5"/>
     <w:basedOn w:val="12"/>
     <w:qFormat/>
@@ -8858,7 +9471,7 @@
       </w:tcPr>
     </w:tblStylePr>
   </w:style>
-  <w:style w:type="table" w:styleId="43">
+  <w:style w:type="table" w:styleId="44">
     <w:name w:val="Light Shading Accent 6"/>
     <w:basedOn w:val="12"/>
     <w:qFormat/>
@@ -8958,7 +9571,7 @@
       </w:tcPr>
     </w:tblStylePr>
   </w:style>
-  <w:style w:type="table" w:styleId="44">
+  <w:style w:type="table" w:styleId="45">
     <w:name w:val="Light List"/>
     <w:basedOn w:val="12"/>
     <w:qFormat/>
@@ -9052,7 +9665,7 @@
       </w:tcPr>
     </w:tblStylePr>
   </w:style>
-  <w:style w:type="table" w:styleId="45">
+  <w:style w:type="table" w:styleId="46">
     <w:name w:val="Light List Accent 1"/>
     <w:basedOn w:val="12"/>
     <w:qFormat/>
@@ -9146,7 +9759,7 @@
       </w:tcPr>
     </w:tblStylePr>
   </w:style>
-  <w:style w:type="table" w:styleId="46">
+  <w:style w:type="table" w:styleId="47">
     <w:name w:val="Light List Accent 2"/>
     <w:basedOn w:val="12"/>
     <w:qFormat/>
@@ -9240,7 +9853,7 @@
       </w:tcPr>
     </w:tblStylePr>
   </w:style>
-  <w:style w:type="table" w:styleId="47">
+  <w:style w:type="table" w:styleId="48">
     <w:name w:val="Light List Accent 3"/>
     <w:basedOn w:val="12"/>
     <w:qFormat/>
@@ -9334,7 +9947,7 @@
       </w:tcPr>
     </w:tblStylePr>
   </w:style>
-  <w:style w:type="table" w:styleId="48">
+  <w:style w:type="table" w:styleId="49">
     <w:name w:val="Light List Accent 4"/>
     <w:basedOn w:val="12"/>
     <w:qFormat/>
@@ -9428,7 +10041,7 @@
       </w:tcPr>
     </w:tblStylePr>
   </w:style>
-  <w:style w:type="table" w:styleId="49">
+  <w:style w:type="table" w:styleId="50">
     <w:name w:val="Light List Accent 5"/>
     <w:basedOn w:val="12"/>
     <w:qFormat/>
@@ -9522,7 +10135,7 @@
       </w:tcPr>
     </w:tblStylePr>
   </w:style>
-  <w:style w:type="table" w:styleId="50">
+  <w:style w:type="table" w:styleId="51">
     <w:name w:val="Light List Accent 6"/>
     <w:basedOn w:val="12"/>
     <w:qFormat/>
@@ -9616,7 +10229,7 @@
       </w:tcPr>
     </w:tblStylePr>
   </w:style>
-  <w:style w:type="table" w:styleId="51">
+  <w:style w:type="table" w:styleId="52">
     <w:name w:val="Light Grid"/>
     <w:basedOn w:val="12"/>
     <w:qFormat/>
@@ -9743,7 +10356,7 @@
       </w:tcPr>
     </w:tblStylePr>
   </w:style>
-  <w:style w:type="table" w:styleId="52">
+  <w:style w:type="table" w:styleId="53">
     <w:name w:val="Light Grid Accent 1"/>
     <w:basedOn w:val="12"/>
     <w:qFormat/>
@@ -9870,7 +10483,7 @@
       </w:tcPr>
     </w:tblStylePr>
   </w:style>
-  <w:style w:type="table" w:styleId="53">
+  <w:style w:type="table" w:styleId="54">
     <w:name w:val="Light Grid Accent 2"/>
     <w:basedOn w:val="12"/>
     <w:qFormat/>
@@ -9997,7 +10610,7 @@
       </w:tcPr>
     </w:tblStylePr>
   </w:style>
-  <w:style w:type="table" w:styleId="54">
+  <w:style w:type="table" w:styleId="55">
     <w:name w:val="Light Grid Accent 3"/>
     <w:basedOn w:val="12"/>
     <w:qFormat/>
@@ -10124,7 +10737,7 @@
       </w:tcPr>
     </w:tblStylePr>
   </w:style>
-  <w:style w:type="table" w:styleId="55">
+  <w:style w:type="table" w:styleId="56">
     <w:name w:val="Light Grid Accent 4"/>
     <w:basedOn w:val="12"/>
     <w:qFormat/>
@@ -10251,7 +10864,7 @@
       </w:tcPr>
     </w:tblStylePr>
   </w:style>
-  <w:style w:type="table" w:styleId="56">
+  <w:style w:type="table" w:styleId="57">
     <w:name w:val="Light Grid Accent 5"/>
     <w:basedOn w:val="12"/>
     <w:qFormat/>
@@ -10378,7 +10991,7 @@
       </w:tcPr>
     </w:tblStylePr>
   </w:style>
-  <w:style w:type="table" w:styleId="57">
+  <w:style w:type="table" w:styleId="58">
     <w:name w:val="Light Grid Accent 6"/>
     <w:basedOn w:val="12"/>
     <w:qFormat/>
@@ -10505,7 +11118,7 @@
       </w:tcPr>
     </w:tblStylePr>
   </w:style>
-  <w:style w:type="table" w:styleId="58">
+  <w:style w:type="table" w:styleId="59">
     <w:name w:val="Medium Shading 1"/>
     <w:basedOn w:val="12"/>
     <w:qFormat/>
@@ -10613,7 +11226,7 @@
       </w:tcPr>
     </w:tblStylePr>
   </w:style>
-  <w:style w:type="table" w:styleId="59">
+  <w:style w:type="table" w:styleId="60">
     <w:name w:val="Medium Shading 1 Accent 1"/>
     <w:basedOn w:val="12"/>
     <w:qFormat/>
@@ -10721,7 +11334,7 @@
       </w:tcPr>
     </w:tblStylePr>
   </w:style>
-  <w:style w:type="table" w:styleId="60">
+  <w:style w:type="table" w:styleId="61">
     <w:name w:val="Medium Shading 1 Accent 2"/>
     <w:basedOn w:val="12"/>
     <w:qFormat/>
@@ -10829,7 +11442,7 @@
       </w:tcPr>
     </w:tblStylePr>
   </w:style>
-  <w:style w:type="table" w:styleId="61">
+  <w:style w:type="table" w:styleId="62">
     <w:name w:val="Medium Shading 1 Accent 3"/>
     <w:basedOn w:val="12"/>
     <w:qFormat/>
@@ -10937,7 +11550,7 @@
       </w:tcPr>
     </w:tblStylePr>
   </w:style>
-  <w:style w:type="table" w:styleId="62">
+  <w:style w:type="table" w:styleId="63">
     <w:name w:val="Medium Shading 1 Accent 4"/>
     <w:basedOn w:val="12"/>
     <w:qFormat/>
@@ -11045,7 +11658,7 @@
       </w:tcPr>
     </w:tblStylePr>
   </w:style>
-  <w:style w:type="table" w:styleId="63">
+  <w:style w:type="table" w:styleId="64">
     <w:name w:val="Medium Shading 1 Accent 5"/>
     <w:basedOn w:val="12"/>
     <w:qFormat/>
@@ -11153,7 +11766,7 @@
       </w:tcPr>
     </w:tblStylePr>
   </w:style>
-  <w:style w:type="table" w:styleId="64">
+  <w:style w:type="table" w:styleId="65">
     <w:name w:val="Medium Shading 1 Accent 6"/>
     <w:basedOn w:val="12"/>
     <w:qFormat/>
@@ -11261,7 +11874,7 @@
       </w:tcPr>
     </w:tblStylePr>
   </w:style>
-  <w:style w:type="table" w:styleId="65">
+  <w:style w:type="table" w:styleId="66">
     <w:name w:val="Medium Shading 2"/>
     <w:basedOn w:val="12"/>
     <w:qFormat/>
@@ -11427,7 +12040,7 @@
       </w:tcPr>
     </w:tblStylePr>
   </w:style>
-  <w:style w:type="table" w:styleId="66">
+  <w:style w:type="table" w:styleId="67">
     <w:name w:val="Medium Shading 2 Accent 1"/>
     <w:basedOn w:val="12"/>
     <w:qFormat/>
@@ -11593,7 +12206,7 @@
       </w:tcPr>
     </w:tblStylePr>
   </w:style>
-  <w:style w:type="table" w:styleId="67">
+  <w:style w:type="table" w:styleId="68">
     <w:name w:val="Medium Shading 2 Accent 2"/>
     <w:basedOn w:val="12"/>
     <w:qFormat/>
@@ -11759,7 +12372,7 @@
       </w:tcPr>
     </w:tblStylePr>
   </w:style>
-  <w:style w:type="table" w:styleId="68">
+  <w:style w:type="table" w:styleId="69">
     <w:name w:val="Medium Shading 2 Accent 3"/>
     <w:basedOn w:val="12"/>
     <w:qFormat/>
@@ -11925,7 +12538,7 @@
       </w:tcPr>
     </w:tblStylePr>
   </w:style>
-  <w:style w:type="table" w:styleId="69">
+  <w:style w:type="table" w:styleId="70">
     <w:name w:val="Medium Shading 2 Accent 4"/>
     <w:basedOn w:val="12"/>
     <w:qFormat/>
@@ -12091,7 +12704,7 @@
       </w:tcPr>
     </w:tblStylePr>
   </w:style>
-  <w:style w:type="table" w:styleId="70">
+  <w:style w:type="table" w:styleId="71">
     <w:name w:val="Medium Shading 2 Accent 5"/>
     <w:basedOn w:val="12"/>
     <w:qFormat/>
@@ -12257,7 +12870,7 @@
       </w:tcPr>
     </w:tblStylePr>
   </w:style>
-  <w:style w:type="table" w:styleId="71">
+  <w:style w:type="table" w:styleId="72">
     <w:name w:val="Medium Shading 2 Accent 6"/>
     <w:basedOn w:val="12"/>
     <w:qFormat/>
@@ -12423,7 +13036,7 @@
       </w:tcPr>
     </w:tblStylePr>
   </w:style>
-  <w:style w:type="table" w:styleId="72">
+  <w:style w:type="table" w:styleId="73">
     <w:name w:val="Medium List 1"/>
     <w:basedOn w:val="12"/>
     <w:qFormat/>
@@ -12514,7 +13127,7 @@
       </w:tcPr>
     </w:tblStylePr>
   </w:style>
-  <w:style w:type="table" w:styleId="73">
+  <w:style w:type="table" w:styleId="74">
     <w:name w:val="Medium List 1 Accent 1"/>
     <w:basedOn w:val="12"/>
     <w:qFormat/>
@@ -12605,7 +13218,7 @@
       </w:tcPr>
     </w:tblStylePr>
   </w:style>
-  <w:style w:type="table" w:styleId="74">
+  <w:style w:type="table" w:styleId="75">
     <w:name w:val="Medium List 1 Accent 2"/>
     <w:basedOn w:val="12"/>
     <w:qFormat/>
@@ -12696,7 +13309,7 @@
       </w:tcPr>
     </w:tblStylePr>
   </w:style>
-  <w:style w:type="table" w:styleId="75">
+  <w:style w:type="table" w:styleId="76">
     <w:name w:val="Medium List 1 Accent 3"/>
     <w:basedOn w:val="12"/>
     <w:qFormat/>
@@ -12787,7 +13400,7 @@
       </w:tcPr>
     </w:tblStylePr>
   </w:style>
-  <w:style w:type="table" w:styleId="76">
+  <w:style w:type="table" w:styleId="77">
     <w:name w:val="Medium List 1 Accent 4"/>
     <w:basedOn w:val="12"/>
     <w:qFormat/>
@@ -12878,7 +13491,7 @@
       </w:tcPr>
     </w:tblStylePr>
   </w:style>
-  <w:style w:type="table" w:styleId="77">
+  <w:style w:type="table" w:styleId="78">
     <w:name w:val="Medium List 1 Accent 5"/>
     <w:basedOn w:val="12"/>
     <w:qFormat/>
@@ -12969,7 +13582,7 @@
       </w:tcPr>
     </w:tblStylePr>
   </w:style>
-  <w:style w:type="table" w:styleId="78">
+  <w:style w:type="table" w:styleId="79">
     <w:name w:val="Medium List 1 Accent 6"/>
     <w:basedOn w:val="12"/>
     <w:qFormat/>
@@ -13060,7 +13673,7 @@
       </w:tcPr>
     </w:tblStylePr>
   </w:style>
-  <w:style w:type="table" w:styleId="79">
+  <w:style w:type="table" w:styleId="80">
     <w:name w:val="Medium List 2"/>
     <w:basedOn w:val="12"/>
     <w:qFormat/>
@@ -13190,7 +13803,7 @@
       </w:tcPr>
     </w:tblStylePr>
   </w:style>
-  <w:style w:type="table" w:styleId="80">
+  <w:style w:type="table" w:styleId="81">
     <w:name w:val="Medium List 2 Accent 1"/>
     <w:basedOn w:val="12"/>
     <w:qFormat/>
@@ -13320,7 +13933,7 @@
       </w:tcPr>
     </w:tblStylePr>
   </w:style>
-  <w:style w:type="table" w:styleId="81">
+  <w:style w:type="table" w:styleId="82">
     <w:name w:val="Medium List 2 Accent 2"/>
     <w:basedOn w:val="12"/>
     <w:qFormat/>
@@ -13450,7 +14063,7 @@
       </w:tcPr>
     </w:tblStylePr>
   </w:style>
-  <w:style w:type="table" w:styleId="82">
+  <w:style w:type="table" w:styleId="83">
     <w:name w:val="Medium List 2 Accent 3"/>
     <w:basedOn w:val="12"/>
     <w:qFormat/>
@@ -13580,7 +14193,7 @@
       </w:tcPr>
     </w:tblStylePr>
   </w:style>
-  <w:style w:type="table" w:styleId="83">
+  <w:style w:type="table" w:styleId="84">
     <w:name w:val="Medium List 2 Accent 4"/>
     <w:basedOn w:val="12"/>
     <w:qFormat/>
@@ -13710,7 +14323,7 @@
       </w:tcPr>
     </w:tblStylePr>
   </w:style>
-  <w:style w:type="table" w:styleId="84">
+  <w:style w:type="table" w:styleId="85">
     <w:name w:val="Medium List 2 Accent 5"/>
     <w:basedOn w:val="12"/>
     <w:qFormat/>
@@ -13840,7 +14453,7 @@
       </w:tcPr>
     </w:tblStylePr>
   </w:style>
-  <w:style w:type="table" w:styleId="85">
+  <w:style w:type="table" w:styleId="86">
     <w:name w:val="Medium List 2 Accent 6"/>
     <w:basedOn w:val="12"/>
     <w:qFormat/>
@@ -13970,7 +14583,7 @@
       </w:tcPr>
     </w:tblStylePr>
   </w:style>
-  <w:style w:type="table" w:styleId="86">
+  <w:style w:type="table" w:styleId="87">
     <w:name w:val="Medium Grid 1"/>
     <w:basedOn w:val="12"/>
     <w:qFormat/>
@@ -14040,7 +14653,7 @@
       </w:tcPr>
     </w:tblStylePr>
   </w:style>
-  <w:style w:type="table" w:styleId="87">
+  <w:style w:type="table" w:styleId="88">
     <w:name w:val="Medium Grid 1 Accent 1"/>
     <w:basedOn w:val="12"/>
     <w:qFormat/>
@@ -14110,7 +14723,7 @@
       </w:tcPr>
     </w:tblStylePr>
   </w:style>
-  <w:style w:type="table" w:styleId="88">
+  <w:style w:type="table" w:styleId="89">
     <w:name w:val="Medium Grid 1 Accent 2"/>
     <w:basedOn w:val="12"/>
     <w:qFormat/>
@@ -14180,7 +14793,7 @@
       </w:tcPr>
     </w:tblStylePr>
   </w:style>
-  <w:style w:type="table" w:styleId="89">
+  <w:style w:type="table" w:styleId="90">
     <w:name w:val="Medium Grid 1 Accent 3"/>
     <w:basedOn w:val="12"/>
     <w:qFormat/>
@@ -14250,7 +14863,7 @@
       </w:tcPr>
     </w:tblStylePr>
   </w:style>
-  <w:style w:type="table" w:styleId="90">
+  <w:style w:type="table" w:styleId="91">
     <w:name w:val="Medium Grid 1 Accent 4"/>
     <w:basedOn w:val="12"/>
     <w:qFormat/>
@@ -14320,7 +14933,7 @@
       </w:tcPr>
     </w:tblStylePr>
   </w:style>
-  <w:style w:type="table" w:styleId="91">
+  <w:style w:type="table" w:styleId="92">
     <w:name w:val="Medium Grid 1 Accent 5"/>
     <w:basedOn w:val="12"/>
     <w:qFormat/>
@@ -14390,7 +15003,7 @@
       </w:tcPr>
     </w:tblStylePr>
   </w:style>
-  <w:style w:type="table" w:styleId="92">
+  <w:style w:type="table" w:styleId="93">
     <w:name w:val="Medium Grid 1 Accent 6"/>
     <w:basedOn w:val="12"/>
     <w:qFormat/>
@@ -14460,7 +15073,7 @@
       </w:tcPr>
     </w:tblStylePr>
   </w:style>
-  <w:style w:type="table" w:styleId="93">
+  <w:style w:type="table" w:styleId="94">
     <w:name w:val="Medium Grid 2"/>
     <w:basedOn w:val="12"/>
     <w:qFormat/>
@@ -14607,7 +15220,7 @@
       </w:tcPr>
     </w:tblStylePr>
   </w:style>
-  <w:style w:type="table" w:styleId="94">
+  <w:style w:type="table" w:styleId="95">
     <w:name w:val="Medium Grid 2 Accent 1"/>
     <w:basedOn w:val="12"/>
     <w:qFormat/>
@@ -14754,7 +15367,7 @@
       </w:tcPr>
     </w:tblStylePr>
   </w:style>
-  <w:style w:type="table" w:styleId="95">
+  <w:style w:type="table" w:styleId="96">
     <w:name w:val="Medium Grid 2 Accent 2"/>
     <w:basedOn w:val="12"/>
     <w:qFormat/>
@@ -14901,7 +15514,7 @@
       </w:tcPr>
     </w:tblStylePr>
   </w:style>
-  <w:style w:type="table" w:styleId="96">
+  <w:style w:type="table" w:styleId="97">
     <w:name w:val="Medium Grid 2 Accent 3"/>
     <w:basedOn w:val="12"/>
     <w:qFormat/>
@@ -15048,7 +15661,7 @@
       </w:tcPr>
     </w:tblStylePr>
   </w:style>
-  <w:style w:type="table" w:styleId="97">
+  <w:style w:type="table" w:styleId="98">
     <w:name w:val="Medium Grid 2 Accent 4"/>
     <w:basedOn w:val="12"/>
     <w:qFormat/>
@@ -15195,7 +15808,7 @@
       </w:tcPr>
     </w:tblStylePr>
   </w:style>
-  <w:style w:type="table" w:styleId="98">
+  <w:style w:type="table" w:styleId="99">
     <w:name w:val="Medium Grid 2 Accent 5"/>
     <w:basedOn w:val="12"/>
     <w:qFormat/>
@@ -15342,7 +15955,7 @@
       </w:tcPr>
     </w:tblStylePr>
   </w:style>
-  <w:style w:type="table" w:styleId="99">
+  <w:style w:type="table" w:styleId="100">
     <w:name w:val="Medium Grid 2 Accent 6"/>
     <w:basedOn w:val="12"/>
     <w:qFormat/>
@@ -15489,7 +16102,7 @@
       </w:tcPr>
     </w:tblStylePr>
   </w:style>
-  <w:style w:type="table" w:styleId="100">
+  <w:style w:type="table" w:styleId="101">
     <w:name w:val="Medium Grid 3"/>
     <w:basedOn w:val="12"/>
     <w:qFormat/>
@@ -15647,7 +16260,7 @@
       </w:tcPr>
     </w:tblStylePr>
   </w:style>
-  <w:style w:type="table" w:styleId="101">
+  <w:style w:type="table" w:styleId="102">
     <w:name w:val="Medium Grid 3 Accent 1"/>
     <w:basedOn w:val="12"/>
     <w:qFormat/>
@@ -15805,7 +16418,7 @@
       </w:tcPr>
     </w:tblStylePr>
   </w:style>
-  <w:style w:type="table" w:styleId="102">
+  <w:style w:type="table" w:styleId="103">
     <w:name w:val="Medium Grid 3 Accent 2"/>
     <w:basedOn w:val="12"/>
     <w:qFormat/>
@@ -15963,7 +16576,7 @@
       </w:tcPr>
     </w:tblStylePr>
   </w:style>
-  <w:style w:type="table" w:styleId="103">
+  <w:style w:type="table" w:styleId="104">
     <w:name w:val="Medium Grid 3 Accent 3"/>
     <w:basedOn w:val="12"/>
     <w:qFormat/>
@@ -16121,7 +16734,7 @@
       </w:tcPr>
     </w:tblStylePr>
   </w:style>
-  <w:style w:type="table" w:styleId="104">
+  <w:style w:type="table" w:styleId="105">
     <w:name w:val="Medium Grid 3 Accent 4"/>
     <w:basedOn w:val="12"/>
     <w:qFormat/>
@@ -16279,7 +16892,7 @@
       </w:tcPr>
     </w:tblStylePr>
   </w:style>
-  <w:style w:type="table" w:styleId="105">
+  <w:style w:type="table" w:styleId="106">
     <w:name w:val="Medium Grid 3 Accent 5"/>
     <w:basedOn w:val="12"/>
     <w:qFormat/>
@@ -16437,7 +17050,7 @@
       </w:tcPr>
     </w:tblStylePr>
   </w:style>
-  <w:style w:type="table" w:styleId="106">
+  <w:style w:type="table" w:styleId="107">
     <w:name w:val="Medium Grid 3 Accent 6"/>
     <w:basedOn w:val="12"/>
     <w:qFormat/>
@@ -16595,7 +17208,7 @@
       </w:tcPr>
     </w:tblStylePr>
   </w:style>
-  <w:style w:type="table" w:styleId="107">
+  <w:style w:type="table" w:styleId="108">
     <w:name w:val="Dark List"/>
     <w:basedOn w:val="12"/>
     <w:qFormat/>
@@ -16711,7 +17324,7 @@
       </w:tcPr>
     </w:tblStylePr>
   </w:style>
-  <w:style w:type="table" w:styleId="108">
+  <w:style w:type="table" w:styleId="109">
     <w:name w:val="Dark List Accent 1"/>
     <w:basedOn w:val="12"/>
     <w:qFormat/>
@@ -16827,7 +17440,7 @@
       </w:tcPr>
     </w:tblStylePr>
   </w:style>
-  <w:style w:type="table" w:styleId="109">
+  <w:style w:type="table" w:styleId="110">
     <w:name w:val="Dark List Accent 2"/>
     <w:basedOn w:val="12"/>
     <w:qFormat/>
@@ -16943,7 +17556,7 @@
       </w:tcPr>
     </w:tblStylePr>
   </w:style>
-  <w:style w:type="table" w:styleId="110">
+  <w:style w:type="table" w:styleId="111">
     <w:name w:val="Dark List Accent 3"/>
     <w:basedOn w:val="12"/>
     <w:qFormat/>
@@ -17059,7 +17672,7 @@
       </w:tcPr>
     </w:tblStylePr>
   </w:style>
-  <w:style w:type="table" w:styleId="111">
+  <w:style w:type="table" w:styleId="112">
     <w:name w:val="Dark List Accent 4"/>
     <w:basedOn w:val="12"/>
     <w:qFormat/>
@@ -17175,7 +17788,7 @@
       </w:tcPr>
     </w:tblStylePr>
   </w:style>
-  <w:style w:type="table" w:styleId="112">
+  <w:style w:type="table" w:styleId="113">
     <w:name w:val="Dark List Accent 5"/>
     <w:basedOn w:val="12"/>
     <w:qFormat/>
@@ -17291,7 +17904,7 @@
       </w:tcPr>
     </w:tblStylePr>
   </w:style>
-  <w:style w:type="table" w:styleId="113">
+  <w:style w:type="table" w:styleId="114">
     <w:name w:val="Dark List Accent 6"/>
     <w:basedOn w:val="12"/>
     <w:qFormat/>
@@ -17407,7 +18020,7 @@
       </w:tcPr>
     </w:tblStylePr>
   </w:style>
-  <w:style w:type="table" w:styleId="114">
+  <w:style w:type="table" w:styleId="115">
     <w:name w:val="Colorful Shading"/>
     <w:basedOn w:val="12"/>
     <w:qFormat/>
@@ -17556,7 +18169,7 @@
       </w:rPr>
     </w:tblStylePr>
   </w:style>
-  <w:style w:type="table" w:styleId="115">
+  <w:style w:type="table" w:styleId="116">
     <w:name w:val="Colorful Shading Accent 1"/>
     <w:basedOn w:val="12"/>
     <w:qFormat/>
@@ -17705,7 +18318,7 @@
       </w:rPr>
     </w:tblStylePr>
   </w:style>
-  <w:style w:type="table" w:styleId="116">
+  <w:style w:type="table" w:styleId="117">
     <w:name w:val="Colorful Shading Accent 2"/>
     <w:basedOn w:val="12"/>
     <w:qFormat/>
@@ -17854,7 +18467,7 @@
       </w:rPr>
     </w:tblStylePr>
   </w:style>
-  <w:style w:type="table" w:styleId="117">
+  <w:style w:type="table" w:styleId="118">
     <w:name w:val="Colorful Shading Accent 3"/>
     <w:basedOn w:val="12"/>
     <w:qFormat/>
@@ -17983,7 +18596,7 @@
       </w:tcPr>
     </w:tblStylePr>
   </w:style>
-  <w:style w:type="table" w:styleId="118">
+  <w:style w:type="table" w:styleId="119">
     <w:name w:val="Colorful Shading Accent 4"/>
     <w:basedOn w:val="12"/>
     <w:qFormat/>
@@ -18132,7 +18745,7 @@
       </w:rPr>
     </w:tblStylePr>
   </w:style>
-  <w:style w:type="table" w:styleId="119">
+  <w:style w:type="table" w:styleId="120">
     <w:name w:val="Colorful Shading Accent 5"/>
     <w:basedOn w:val="12"/>
     <w:qFormat/>
@@ -18281,7 +18894,7 @@
       </w:rPr>
     </w:tblStylePr>
   </w:style>
-  <w:style w:type="table" w:styleId="120">
+  <w:style w:type="table" w:styleId="121">
     <w:name w:val="Colorful Shading Accent 6"/>
     <w:basedOn w:val="12"/>
     <w:qFormat/>
@@ -18430,7 +19043,7 @@
       </w:rPr>
     </w:tblStylePr>
   </w:style>
-  <w:style w:type="table" w:styleId="121">
+  <w:style w:type="table" w:styleId="122">
     <w:name w:val="Colorful List"/>
     <w:basedOn w:val="12"/>
     <w:qFormat/>
@@ -18523,7 +19136,7 @@
       </w:tcPr>
     </w:tblStylePr>
   </w:style>
-  <w:style w:type="table" w:styleId="122">
+  <w:style w:type="table" w:styleId="123">
     <w:name w:val="Colorful List Accent 1"/>
     <w:basedOn w:val="12"/>
     <w:qFormat/>
@@ -18616,7 +19229,7 @@
       </w:tcPr>
     </w:tblStylePr>
   </w:style>
-  <w:style w:type="table" w:styleId="123">
+  <w:style w:type="table" w:styleId="124">
     <w:name w:val="Colorful List Accent 2"/>
     <w:basedOn w:val="12"/>
     <w:qFormat/>
@@ -18709,7 +19322,7 @@
       </w:tcPr>
     </w:tblStylePr>
   </w:style>
-  <w:style w:type="table" w:styleId="124">
+  <w:style w:type="table" w:styleId="125">
     <w:name w:val="Colorful List Accent 3"/>
     <w:basedOn w:val="12"/>
     <w:qFormat/>
@@ -18802,7 +19415,7 @@
       </w:tcPr>
     </w:tblStylePr>
   </w:style>
-  <w:style w:type="table" w:styleId="125">
+  <w:style w:type="table" w:styleId="126">
     <w:name w:val="Colorful List Accent 4"/>
     <w:basedOn w:val="12"/>
     <w:qFormat/>
@@ -18895,7 +19508,7 @@
       </w:tcPr>
     </w:tblStylePr>
   </w:style>
-  <w:style w:type="table" w:styleId="126">
+  <w:style w:type="table" w:styleId="127">
     <w:name w:val="Colorful List Accent 5"/>
     <w:basedOn w:val="12"/>
     <w:qFormat/>
@@ -18988,7 +19601,7 @@
       </w:tcPr>
     </w:tblStylePr>
   </w:style>
-  <w:style w:type="table" w:styleId="127">
+  <w:style w:type="table" w:styleId="128">
     <w:name w:val="Colorful List Accent 6"/>
     <w:basedOn w:val="12"/>
     <w:qFormat/>
@@ -19081,7 +19694,7 @@
       </w:tcPr>
     </w:tblStylePr>
   </w:style>
-  <w:style w:type="table" w:styleId="128">
+  <w:style w:type="table" w:styleId="129">
     <w:name w:val="Colorful Grid"/>
     <w:basedOn w:val="12"/>
     <w:qFormat/>
@@ -19178,7 +19791,7 @@
       </w:tcPr>
     </w:tblStylePr>
   </w:style>
-  <w:style w:type="table" w:styleId="129">
+  <w:style w:type="table" w:styleId="130">
     <w:name w:val="Colorful Grid Accent 1"/>
     <w:basedOn w:val="12"/>
     <w:qFormat/>
@@ -19275,7 +19888,7 @@
       </w:tcPr>
     </w:tblStylePr>
   </w:style>
-  <w:style w:type="table" w:styleId="130">
+  <w:style w:type="table" w:styleId="131">
     <w:name w:val="Colorful Grid Accent 2"/>
     <w:basedOn w:val="12"/>
     <w:qFormat/>
@@ -19372,7 +19985,7 @@
       </w:tcPr>
     </w:tblStylePr>
   </w:style>
-  <w:style w:type="table" w:styleId="131">
+  <w:style w:type="table" w:styleId="132">
     <w:name w:val="Colorful Grid Accent 3"/>
     <w:basedOn w:val="12"/>
     <w:qFormat/>
@@ -19469,7 +20082,7 @@
       </w:tcPr>
     </w:tblStylePr>
   </w:style>
-  <w:style w:type="table" w:styleId="132">
+  <w:style w:type="table" w:styleId="133">
     <w:name w:val="Colorful Grid Accent 4"/>
     <w:basedOn w:val="12"/>
     <w:qFormat/>
@@ -19566,7 +20179,7 @@
       </w:tcPr>
     </w:tblStylePr>
   </w:style>
-  <w:style w:type="table" w:styleId="133">
+  <w:style w:type="table" w:styleId="134">
     <w:name w:val="Colorful Grid Accent 5"/>
     <w:basedOn w:val="12"/>
     <w:qFormat/>
@@ -19663,7 +20276,7 @@
       </w:tcPr>
     </w:tblStylePr>
   </w:style>
-  <w:style w:type="table" w:styleId="134">
+  <w:style w:type="table" w:styleId="135">
     <w:name w:val="Colorful Grid Accent 6"/>
     <w:basedOn w:val="12"/>
     <w:qFormat/>
@@ -19760,21 +20373,21 @@
       </w:tcPr>
     </w:tblStylePr>
   </w:style>
-  <w:style w:type="character" w:customStyle="1" w:styleId="135">
+  <w:style w:type="character" w:customStyle="1" w:styleId="136">
     <w:name w:val="Header Char"/>
     <w:basedOn w:val="11"/>
     <w:link w:val="19"/>
     <w:qFormat/>
     <w:uiPriority w:val="99"/>
   </w:style>
-  <w:style w:type="character" w:customStyle="1" w:styleId="136">
+  <w:style w:type="character" w:customStyle="1" w:styleId="137">
     <w:name w:val="Footer Char"/>
     <w:basedOn w:val="11"/>
     <w:link w:val="18"/>
     <w:qFormat/>
     <w:uiPriority w:val="99"/>
   </w:style>
-  <w:style w:type="paragraph" w:styleId="137">
+  <w:style w:type="paragraph" w:styleId="138">
     <w:name w:val="No Spacing"/>
     <w:qFormat/>
     <w:uiPriority w:val="1"/>
@@ -19788,7 +20401,7 @@
       <w:lang w:val="en-US" w:eastAsia="en-US" w:bidi="ar-SA"/>
     </w:rPr>
   </w:style>
-  <w:style w:type="character" w:customStyle="1" w:styleId="138">
+  <w:style w:type="character" w:customStyle="1" w:styleId="139">
     <w:name w:val="Heading 1 Char"/>
     <w:basedOn w:val="11"/>
     <w:link w:val="2"/>
@@ -19803,7 +20416,7 @@
       <w:szCs w:val="28"/>
     </w:rPr>
   </w:style>
-  <w:style w:type="character" w:customStyle="1" w:styleId="139">
+  <w:style w:type="character" w:customStyle="1" w:styleId="140">
     <w:name w:val="Heading 2 Char"/>
     <w:basedOn w:val="11"/>
     <w:link w:val="3"/>
@@ -19823,7 +20436,7 @@
       </w14:textFill>
     </w:rPr>
   </w:style>
-  <w:style w:type="character" w:customStyle="1" w:styleId="140">
+  <w:style w:type="character" w:customStyle="1" w:styleId="141">
     <w:name w:val="Heading 3 Char"/>
     <w:basedOn w:val="11"/>
     <w:link w:val="4"/>
@@ -19841,10 +20454,10 @@
       </w14:textFill>
     </w:rPr>
   </w:style>
-  <w:style w:type="character" w:customStyle="1" w:styleId="141">
+  <w:style w:type="character" w:customStyle="1" w:styleId="142">
     <w:name w:val="Title Char"/>
     <w:basedOn w:val="11"/>
-    <w:link w:val="36"/>
+    <w:link w:val="37"/>
     <w:qFormat/>
     <w:uiPriority w:val="10"/>
     <w:rPr>
@@ -19856,10 +20469,10 @@
       <w:szCs w:val="52"/>
     </w:rPr>
   </w:style>
-  <w:style w:type="character" w:customStyle="1" w:styleId="142">
+  <w:style w:type="character" w:customStyle="1" w:styleId="143">
     <w:name w:val="Subtitle Char"/>
     <w:basedOn w:val="11"/>
-    <w:link w:val="34"/>
+    <w:link w:val="35"/>
     <w:qFormat/>
     <w:uiPriority w:val="11"/>
     <w:rPr>
@@ -19877,7 +20490,7 @@
       </w14:textFill>
     </w:rPr>
   </w:style>
-  <w:style w:type="paragraph" w:styleId="143">
+  <w:style w:type="paragraph" w:styleId="144">
     <w:name w:val="List Paragraph"/>
     <w:basedOn w:val="1"/>
     <w:qFormat/>
@@ -19887,21 +20500,21 @@
       <w:contextualSpacing/>
     </w:pPr>
   </w:style>
-  <w:style w:type="character" w:customStyle="1" w:styleId="144">
+  <w:style w:type="character" w:customStyle="1" w:styleId="145">
     <w:name w:val="Body Text Char"/>
     <w:basedOn w:val="11"/>
     <w:link w:val="13"/>
     <w:qFormat/>
     <w:uiPriority w:val="99"/>
   </w:style>
-  <w:style w:type="character" w:customStyle="1" w:styleId="145">
+  <w:style w:type="character" w:customStyle="1" w:styleId="146">
     <w:name w:val="Body Text 2 Char"/>
     <w:basedOn w:val="11"/>
     <w:link w:val="14"/>
     <w:qFormat/>
     <w:uiPriority w:val="99"/>
   </w:style>
-  <w:style w:type="character" w:customStyle="1" w:styleId="146">
+  <w:style w:type="character" w:customStyle="1" w:styleId="147">
     <w:name w:val="Body Text 3 Char"/>
     <w:basedOn w:val="11"/>
     <w:link w:val="15"/>
@@ -19912,7 +20525,7 @@
       <w:szCs w:val="16"/>
     </w:rPr>
   </w:style>
-  <w:style w:type="character" w:customStyle="1" w:styleId="147">
+  <w:style w:type="character" w:customStyle="1" w:styleId="148">
     <w:name w:val="Macro Text Char"/>
     <w:basedOn w:val="11"/>
     <w:link w:val="32"/>
@@ -19924,10 +20537,27 @@
       <w:szCs w:val="20"/>
     </w:rPr>
   </w:style>
-  <w:style w:type="paragraph" w:styleId="148">
+  <w:style w:type="paragraph" w:styleId="149">
     <w:name w:val="Quote"/>
     <w:basedOn w:val="1"/>
     <w:next w:val="1"/>
+    <w:link w:val="150"/>
+    <w:qFormat/>
+    <w:uiPriority w:val="29"/>
+    <w:rPr>
+      <w:i/>
+      <w:iCs/>
+      <w:color w:val="000000" w:themeColor="text1"/>
+      <w14:textFill>
+        <w14:solidFill>
+          <w14:schemeClr w14:val="tx1"/>
+        </w14:solidFill>
+      </w14:textFill>
+    </w:rPr>
+  </w:style>
+  <w:style w:type="character" w:customStyle="1" w:styleId="150">
+    <w:name w:val="Quote Char"/>
+    <w:basedOn w:val="11"/>
     <w:link w:val="149"/>
     <w:qFormat/>
     <w:uiPriority w:val="29"/>
@@ -19942,24 +20572,7 @@
       </w14:textFill>
     </w:rPr>
   </w:style>
-  <w:style w:type="character" w:customStyle="1" w:styleId="149">
-    <w:name w:val="Quote Char"/>
-    <w:basedOn w:val="11"/>
-    <w:link w:val="148"/>
-    <w:qFormat/>
-    <w:uiPriority w:val="29"/>
-    <w:rPr>
-      <w:i/>
-      <w:iCs/>
-      <w:color w:val="000000" w:themeColor="text1"/>
-      <w14:textFill>
-        <w14:solidFill>
-          <w14:schemeClr w14:val="tx1"/>
-        </w14:solidFill>
-      </w14:textFill>
-    </w:rPr>
-  </w:style>
-  <w:style w:type="character" w:customStyle="1" w:styleId="150">
+  <w:style w:type="character" w:customStyle="1" w:styleId="151">
     <w:name w:val="Heading 4 Char"/>
     <w:basedOn w:val="11"/>
     <w:link w:val="5"/>
@@ -19980,7 +20593,7 @@
       </w14:textFill>
     </w:rPr>
   </w:style>
-  <w:style w:type="character" w:customStyle="1" w:styleId="151">
+  <w:style w:type="character" w:customStyle="1" w:styleId="152">
     <w:name w:val="Heading 5 Char"/>
     <w:basedOn w:val="11"/>
     <w:link w:val="6"/>
@@ -19992,7 +20605,7 @@
       <w:color w:val="254061" w:themeColor="accent1" w:themeShade="80"/>
     </w:rPr>
   </w:style>
-  <w:style w:type="character" w:customStyle="1" w:styleId="152">
+  <w:style w:type="character" w:customStyle="1" w:styleId="153">
     <w:name w:val="Heading 6 Char"/>
     <w:basedOn w:val="11"/>
     <w:link w:val="7"/>
@@ -20006,7 +20619,7 @@
       <w:color w:val="254061" w:themeColor="accent1" w:themeShade="80"/>
     </w:rPr>
   </w:style>
-  <w:style w:type="character" w:customStyle="1" w:styleId="153">
+  <w:style w:type="character" w:customStyle="1" w:styleId="154">
     <w:name w:val="Heading 7 Char"/>
     <w:basedOn w:val="11"/>
     <w:link w:val="8"/>
@@ -20028,7 +20641,7 @@
       </w14:textFill>
     </w:rPr>
   </w:style>
-  <w:style w:type="character" w:customStyle="1" w:styleId="154">
+  <w:style w:type="character" w:customStyle="1" w:styleId="155">
     <w:name w:val="Heading 8 Char"/>
     <w:basedOn w:val="11"/>
     <w:link w:val="9"/>
@@ -20047,7 +20660,7 @@
       </w14:textFill>
     </w:rPr>
   </w:style>
-  <w:style w:type="character" w:customStyle="1" w:styleId="155">
+  <w:style w:type="character" w:customStyle="1" w:styleId="156">
     <w:name w:val="Heading 9 Char"/>
     <w:basedOn w:val="11"/>
     <w:link w:val="10"/>
@@ -20071,11 +20684,11 @@
       </w14:textFill>
     </w:rPr>
   </w:style>
-  <w:style w:type="paragraph" w:styleId="156">
+  <w:style w:type="paragraph" w:styleId="157">
     <w:name w:val="Intense Quote"/>
     <w:basedOn w:val="1"/>
     <w:next w:val="1"/>
-    <w:link w:val="157"/>
+    <w:link w:val="158"/>
     <w:qFormat/>
     <w:uiPriority w:val="30"/>
     <w:pPr>
@@ -20098,10 +20711,10 @@
       </w14:textFill>
     </w:rPr>
   </w:style>
-  <w:style w:type="character" w:customStyle="1" w:styleId="157">
+  <w:style w:type="character" w:customStyle="1" w:styleId="158">
     <w:name w:val="Intense Quote Char"/>
     <w:basedOn w:val="11"/>
-    <w:link w:val="156"/>
+    <w:link w:val="157"/>
     <w:qFormat/>
     <w:uiPriority w:val="30"/>
     <w:rPr>
@@ -20117,7 +20730,7 @@
       </w14:textFill>
     </w:rPr>
   </w:style>
-  <w:style w:type="character" w:customStyle="1" w:styleId="158">
+  <w:style w:type="character" w:customStyle="1" w:styleId="159">
     <w:name w:val="Subtle Emphasis"/>
     <w:basedOn w:val="11"/>
     <w:qFormat/>
@@ -20136,7 +20749,7 @@
       </w14:textFill>
     </w:rPr>
   </w:style>
-  <w:style w:type="character" w:customStyle="1" w:styleId="159">
+  <w:style w:type="character" w:customStyle="1" w:styleId="160">
     <w:name w:val="Intense Emphasis"/>
     <w:basedOn w:val="11"/>
     <w:qFormat/>
@@ -20154,7 +20767,7 @@
       </w14:textFill>
     </w:rPr>
   </w:style>
-  <w:style w:type="character" w:customStyle="1" w:styleId="160">
+  <w:style w:type="character" w:customStyle="1" w:styleId="161">
     <w:name w:val="Subtle Reference"/>
     <w:basedOn w:val="11"/>
     <w:qFormat/>
@@ -20170,7 +20783,7 @@
       </w14:textFill>
     </w:rPr>
   </w:style>
-  <w:style w:type="character" w:customStyle="1" w:styleId="161">
+  <w:style w:type="character" w:customStyle="1" w:styleId="162">
     <w:name w:val="Intense Reference"/>
     <w:basedOn w:val="11"/>
     <w:qFormat/>
@@ -20189,7 +20802,7 @@
       </w14:textFill>
     </w:rPr>
   </w:style>
-  <w:style w:type="character" w:customStyle="1" w:styleId="162">
+  <w:style w:type="character" w:customStyle="1" w:styleId="163">
     <w:name w:val="Book Title"/>
     <w:basedOn w:val="11"/>
     <w:qFormat/>
@@ -20201,7 +20814,7 @@
       <w:spacing w:val="5"/>
     </w:rPr>
   </w:style>
-  <w:style w:type="paragraph" w:customStyle="1" w:styleId="163">
+  <w:style w:type="paragraph" w:customStyle="1" w:styleId="164">
     <w:name w:val="TOC Heading"/>
     <w:basedOn w:val="2"/>
     <w:next w:val="1"/>
@@ -20213,7 +20826,7 @@
       <w:outlineLvl w:val="9"/>
     </w:pPr>
   </w:style>
-  <w:style w:type="paragraph" w:customStyle="1" w:styleId="164">
+  <w:style w:type="paragraph" w:customStyle="1" w:styleId="165">
     <w:name w:val="Body Small"/>
     <w:basedOn w:val="1"/>
     <w:qFormat/>
@@ -20227,7 +20840,7 @@
       <w:sz w:val="19"/>
     </w:rPr>
   </w:style>
-  <w:style w:type="paragraph" w:customStyle="1" w:styleId="165">
+  <w:style w:type="paragraph" w:customStyle="1" w:styleId="166">
     <w:name w:val="Section Heading"/>
     <w:basedOn w:val="1"/>
     <w:qFormat/>
@@ -20243,7 +20856,7 @@
       <w:sz w:val="28"/>
     </w:rPr>
   </w:style>
-  <w:style w:type="paragraph" w:customStyle="1" w:styleId="166">
+  <w:style w:type="paragraph" w:customStyle="1" w:styleId="167">
     <w:name w:val="Subsection Heading"/>
     <w:basedOn w:val="1"/>
     <w:qFormat/>
@@ -20259,7 +20872,7 @@
       <w:sz w:val="23"/>
     </w:rPr>
   </w:style>
-  <w:style w:type="paragraph" w:customStyle="1" w:styleId="167">
+  <w:style w:type="paragraph" w:customStyle="1" w:styleId="168">
     <w:name w:val="Reference"/>
     <w:basedOn w:val="1"/>
     <w:qFormat/>

</xml_diff>